<commit_message>
Add bank-wise KYC notice mailer with NIC mail, records and WhatsApp
- Build one KYC notice per bank (Word, PDF, KYC Excel) from a pending KYC
  sheet, addressed to "The Nodal Officer," with the bank name on the next line.
- New "KYC Notice Mailer (NIC Mail)" page: matches banks to the e-mail
  sheet, previews the mail, and sends each bank its notice straight through
  smtp.mgovcloud.in. The body is the notice without stamp and signature;
  only the PDF and Excel are attached, never the Word file.
- Send log prevents sending the same notice twice; the page is locked with
  a hashed page password.
- Saves a sent-mail screenshot per bank for the record, with a ZIP download.
- Optional WhatsApp Web sender (one login per officer) posts each
  screenshot with the bank name as caption.

Co-Authored-By: Claude Opus 5 <noreply@anthropic.com>
</commit_message>
<xml_diff>
--- a/assets/kyc_notice_template.docx
+++ b/assets/kyc_notice_template.docx
@@ -1,6 +1,6 @@
 
 <file path=word/document.xml><?xml version="1.0" encoding="utf-8"?>
-<w:document xmlns:wpc="http://schemas.microsoft.com/office/word/2010/wordprocessingCanvas" xmlns:cx="http://schemas.microsoft.com/office/drawing/2014/chartex" xmlns:cx1="http://schemas.microsoft.com/office/drawing/2015/9/8/chartex" xmlns:cx2="http://schemas.microsoft.com/office/drawing/2015/10/21/chartex" xmlns:cx3="http://schemas.microsoft.com/office/drawing/2016/5/9/chartex" xmlns:cx4="http://schemas.microsoft.com/office/drawing/2016/5/10/chartex" xmlns:cx5="http://schemas.microsoft.com/office/drawing/2016/5/11/chartex" xmlns:cx6="http://schemas.microsoft.com/office/drawing/2016/5/12/chartex" xmlns:cx7="http://schemas.microsoft.com/office/drawing/2016/5/13/chartex" xmlns:cx8="http://schemas.microsoft.com/office/drawing/2016/5/14/chartex" xmlns:mc="http://schemas.openxmlformats.org/markup-compatibility/2006" xmlns:aink="http://schemas.microsoft.com/office/drawing/2016/ink" xmlns:am3d="http://schemas.microsoft.com/office/drawing/2017/model3d" xmlns:o="urn:schemas-microsoft-com:office:office" xmlns:oel="http://schemas.microsoft.com/office/2019/extlst" xmlns:r="http://schemas.openxmlformats.org/officeDocument/2006/relationships" xmlns:m="http://schemas.openxmlformats.org/officeDocument/2006/math" xmlns:v="urn:schemas-microsoft-com:vml" xmlns:wp14="http://schemas.microsoft.com/office/word/2010/wordprocessingDrawing" xmlns:wp="http://schemas.openxmlformats.org/drawingml/2006/wordprocessingDrawing" xmlns:w10="urn:schemas-microsoft-com:office:word" xmlns:w="http://schemas.openxmlformats.org/wordprocessingml/2006/main" xmlns:w14="http://schemas.microsoft.com/office/word/2010/wordml" xmlns:w15="http://schemas.microsoft.com/office/word/2012/wordml" xmlns:w16cex="http://schemas.microsoft.com/office/word/2018/wordml/cex" xmlns:w16cid="http://schemas.microsoft.com/office/word/2016/wordml/cid" xmlns:w16="http://schemas.microsoft.com/office/word/2018/wordml" xmlns:w16du="http://schemas.microsoft.com/office/word/2023/wordml/word16du" xmlns:w16sdtdh="http://schemas.microsoft.com/office/word/2020/wordml/sdtdatahash" xmlns:w16sdtfl="http://schemas.microsoft.com/office/word/2024/wordml/sdtformatlock" xmlns:w16se="http://schemas.microsoft.com/office/word/2015/wordml/symex" xmlns:wpg="http://schemas.microsoft.com/office/word/2010/wordprocessingGroup" xmlns:wpi="http://schemas.microsoft.com/office/word/2010/wordprocessingInk" xmlns:wne="http://schemas.microsoft.com/office/word/2006/wordml" xmlns:wps="http://schemas.microsoft.com/office/word/2010/wordprocessingShape" mc:Ignorable="w14 w15 w16se w16cid w16 w16cex w16sdtdh w16sdtfl w16du wp14">
+<w:document xmlns:wpc="http://schemas.microsoft.com/office/word/2010/wordprocessingCanvas" xmlns:cx="http://schemas.microsoft.com/office/drawing/2014/chartex" xmlns:cx1="http://schemas.microsoft.com/office/drawing/2015/9/8/chartex" xmlns:cx2="http://schemas.microsoft.com/office/drawing/2015/10/21/chartex" xmlns:cx3="http://schemas.microsoft.com/office/drawing/2016/5/9/chartex" xmlns:cx4="http://schemas.microsoft.com/office/drawing/2016/5/10/chartex" xmlns:cx5="http://schemas.microsoft.com/office/drawing/2016/5/11/chartex" xmlns:cx6="http://schemas.microsoft.com/office/drawing/2016/5/12/chartex" xmlns:cx7="http://schemas.microsoft.com/office/drawing/2016/5/13/chartex" xmlns:cx8="http://schemas.microsoft.com/office/drawing/2016/5/14/chartex" xmlns:mc="http://schemas.openxmlformats.org/markup-compatibility/2006" xmlns:o="urn:schemas-microsoft-com:office:office" xmlns:r="http://schemas.openxmlformats.org/officeDocument/2006/relationships" xmlns:m="http://schemas.openxmlformats.org/officeDocument/2006/math" xmlns:v="urn:schemas-microsoft-com:vml" xmlns:wp14="http://schemas.microsoft.com/office/word/2010/wordprocessingDrawing" xmlns:wp="http://schemas.openxmlformats.org/drawingml/2006/wordprocessingDrawing" xmlns:w="http://schemas.openxmlformats.org/wordprocessingml/2006/main" xmlns:w14="http://schemas.microsoft.com/office/word/2010/wordml" xmlns:w10="urn:schemas-microsoft-com:office:word" xmlns:w15="http://schemas.microsoft.com/office/word/2012/wordml" xmlns:wpg="http://schemas.microsoft.com/office/word/2010/wordprocessingGroup" xmlns:wpi="http://schemas.microsoft.com/office/word/2010/wordprocessingInk" xmlns:wne="http://schemas.microsoft.com/office/word/2006/wordml" xmlns:wps="http://schemas.microsoft.com/office/word/2010/wordprocessingShape" xmlns:wpsCustomData="http://www.wps.cn/officeDocument/2013/wpsCustomData" mc:Ignorable="w14 w15 wp14">
   <w:body>
     <w:p>
       <w:pPr>
@@ -8,20 +8,19 @@
         <w:ind w:left="2880"/>
         <w:jc w:val="center"/>
         <w:rPr>
-          <w:rFonts w:ascii="Times New Roman" w:eastAsia="Times New Roman" w:hAnsi="Times New Roman" w:cs="Times New Roman"/>
+          <w:rFonts w:ascii="Times New Roman" w:hAnsi="Times New Roman" w:eastAsia="Times New Roman" w:cs="Times New Roman"/>
           <w:sz w:val="24"/>
           <w:szCs w:val="24"/>
         </w:rPr>
       </w:pPr>
       <w:r>
         <w:rPr>
-          <w:rFonts w:ascii="Times New Roman" w:eastAsia="Times New Roman" w:hAnsi="Times New Roman" w:cs="Times New Roman"/>
+          <w:rFonts w:ascii="Times New Roman" w:hAnsi="Times New Roman" w:eastAsia="Times New Roman" w:cs="Times New Roman"/>
           <w:b/>
           <w:bCs/>
-          <w:noProof/>
         </w:rPr>
         <w:drawing>
-          <wp:anchor distT="0" distB="0" distL="114300" distR="114300" simplePos="0" relativeHeight="251659264" behindDoc="0" locked="0" layoutInCell="1" allowOverlap="1" wp14:anchorId="3D456424" wp14:editId="2A1F8CED">
+          <wp:anchor distT="0" distB="0" distL="114300" distR="114300" simplePos="0" relativeHeight="251659264" behindDoc="0" locked="0" layoutInCell="1" allowOverlap="1">
             <wp:simplePos x="0" y="0"/>
             <wp:positionH relativeFrom="column">
               <wp:posOffset>-19050</wp:posOffset>
@@ -46,7 +45,7 @@
                     </pic:cNvPicPr>
                   </pic:nvPicPr>
                   <pic:blipFill>
-                    <a:blip r:embed="rId8">
+                    <a:blip r:embed="rId6">
                       <a:extLst>
                         <a:ext uri="{28A0092B-C50C-407E-A947-70E740481C1C}">
                           <a14:useLocalDpi xmlns:a14="http://schemas.microsoft.com/office/drawing/2010/main" val="0"/>
@@ -79,7 +78,7 @@
       </w:r>
       <w:r>
         <w:rPr>
-          <w:rFonts w:ascii="Times New Roman" w:eastAsia="Times New Roman" w:hAnsi="Times New Roman" w:cs="Times New Roman"/>
+          <w:rFonts w:ascii="Times New Roman" w:hAnsi="Times New Roman" w:eastAsia="Times New Roman" w:cs="Times New Roman"/>
           <w:b/>
           <w:bCs/>
           <w:sz w:val="28"/>
@@ -90,39 +89,49 @@
       </w:r>
       <w:r>
         <w:rPr>
-          <w:rFonts w:ascii="Times New Roman" w:eastAsia="Times New Roman" w:hAnsi="Times New Roman" w:cs="Times New Roman"/>
+          <w:rFonts w:ascii="Times New Roman" w:hAnsi="Times New Roman" w:eastAsia="Times New Roman" w:cs="Times New Roman"/>
           <w:b/>
           <w:bCs/>
           <w:sz w:val="28"/>
           <w:szCs w:val="28"/>
           <w:u w:val="single"/>
         </w:rPr>
-        <w:br/>
-        <w:t>Cyber Centre of Excellence</w:t>
-      </w:r>
-      <w:r>
-        <w:rPr>
-          <w:rFonts w:ascii="Times New Roman" w:eastAsia="Times New Roman" w:hAnsi="Times New Roman" w:cs="Times New Roman"/>
+        <w:br w:type="textWrapping"/>
+      </w:r>
+      <w:r>
+        <w:rPr>
+          <w:rFonts w:ascii="Times New Roman" w:hAnsi="Times New Roman" w:eastAsia="Times New Roman" w:cs="Times New Roman"/>
           <w:b/>
           <w:bCs/>
           <w:sz w:val="28"/>
           <w:szCs w:val="28"/>
-        </w:rPr>
-        <w:t>,</w:t>
-      </w:r>
-      <w:r>
-        <w:rPr>
-          <w:rFonts w:ascii="Times New Roman" w:eastAsia="Times New Roman" w:hAnsi="Times New Roman" w:cs="Times New Roman"/>
+          <w:u w:val="single"/>
+        </w:rPr>
+        <w:t>Cyber Centre of Excellence</w:t>
+      </w:r>
+      <w:r>
+        <w:rPr>
+          <w:rFonts w:ascii="Times New Roman" w:hAnsi="Times New Roman" w:eastAsia="Times New Roman" w:cs="Times New Roman"/>
           <w:b/>
           <w:bCs/>
           <w:sz w:val="28"/>
           <w:szCs w:val="28"/>
         </w:rPr>
-        <w:br/>
-      </w:r>
-      <w:r>
-        <w:rPr>
-          <w:rFonts w:ascii="Times New Roman" w:eastAsia="Times New Roman" w:hAnsi="Times New Roman" w:cs="Times New Roman"/>
+        <w:t>,</w:t>
+      </w:r>
+      <w:r>
+        <w:rPr>
+          <w:rFonts w:ascii="Times New Roman" w:hAnsi="Times New Roman" w:eastAsia="Times New Roman" w:cs="Times New Roman"/>
+          <w:b/>
+          <w:bCs/>
+          <w:sz w:val="28"/>
+          <w:szCs w:val="28"/>
+        </w:rPr>
+        <w:br w:type="textWrapping"/>
+      </w:r>
+      <w:r>
+        <w:rPr>
+          <w:rFonts w:ascii="Times New Roman" w:hAnsi="Times New Roman" w:eastAsia="Times New Roman" w:cs="Times New Roman"/>
           <w:sz w:val="24"/>
           <w:szCs w:val="24"/>
         </w:rPr>
@@ -142,7 +151,7 @@
       </w:pPr>
       <w:r>
         <w:rPr>
-          <w:rFonts w:ascii="Times New Roman" w:eastAsia="Times New Roman" w:hAnsi="Times New Roman" w:cs="Times New Roman"/>
+          <w:rFonts w:ascii="Times New Roman" w:hAnsi="Times New Roman" w:eastAsia="Times New Roman" w:cs="Times New Roman"/>
           <w:sz w:val="24"/>
           <w:szCs w:val="24"/>
         </w:rPr>
@@ -150,36 +159,57 @@
       </w:r>
       <w:r>
         <w:rPr>
-          <w:rFonts w:ascii="Times New Roman" w:eastAsia="Times New Roman" w:hAnsi="Times New Roman" w:cs="Times New Roman"/>
-          <w:sz w:val="24"/>
-          <w:szCs w:val="24"/>
-        </w:rPr>
-        <w:br/>
+          <w:rFonts w:ascii="Times New Roman" w:hAnsi="Times New Roman" w:eastAsia="Times New Roman" w:cs="Times New Roman"/>
+          <w:sz w:val="24"/>
+          <w:szCs w:val="24"/>
+        </w:rPr>
+        <w:br w:type="textWrapping"/>
+      </w:r>
+      <w:r>
+        <w:rPr>
+          <w:rFonts w:ascii="Times New Roman" w:hAnsi="Times New Roman" w:eastAsia="Times New Roman" w:cs="Times New Roman"/>
+          <w:sz w:val="24"/>
+          <w:szCs w:val="24"/>
+        </w:rPr>
         <w:t>Phone No: 079-23250798</w:t>
       </w:r>
       <w:r>
         <w:rPr>
-          <w:rFonts w:ascii="Times New Roman" w:eastAsia="Times New Roman" w:hAnsi="Times New Roman" w:cs="Times New Roman"/>
-          <w:sz w:val="24"/>
-          <w:szCs w:val="24"/>
-        </w:rPr>
-        <w:br/>
-      </w:r>
-      <w:r>
-        <w:rPr>
-          <w:rFonts w:ascii="Times New Roman" w:eastAsia="Times New Roman" w:hAnsi="Times New Roman" w:cs="Times New Roman"/>
+          <w:rFonts w:ascii="Times New Roman" w:hAnsi="Times New Roman" w:eastAsia="Times New Roman" w:cs="Times New Roman"/>
+          <w:sz w:val="24"/>
+          <w:szCs w:val="24"/>
+        </w:rPr>
+        <w:br w:type="textWrapping"/>
+      </w:r>
+      <w:r>
+        <w:rPr>
+          <w:rFonts w:ascii="Times New Roman" w:hAnsi="Times New Roman" w:eastAsia="Times New Roman" w:cs="Times New Roman"/>
         </w:rPr>
         <w:t xml:space="preserve">E-Mail: </w:t>
       </w:r>
-      <w:hyperlink r:id="rId9" w:history="1">
-        <w:r>
-          <w:rPr>
-            <w:rStyle w:val="Hyperlink"/>
-            <w:rFonts w:ascii="Times New Roman" w:eastAsia="Times New Roman" w:hAnsi="Times New Roman" w:cs="Times New Roman"/>
-          </w:rPr>
-          <w:t>helpline-cyber-cid@gujarat.gov.in</w:t>
-        </w:r>
-      </w:hyperlink>
+      <w:r>
+        <w:fldChar w:fldCharType="begin"/>
+      </w:r>
+      <w:r>
+        <w:instrText xml:space="preserve"> HYPERLINK "mailto:helpline-cyber-cid@gujarat.gov.in" </w:instrText>
+      </w:r>
+      <w:r>
+        <w:fldChar w:fldCharType="separate"/>
+      </w:r>
+      <w:r>
+        <w:rPr>
+          <w:rStyle w:val="15"/>
+          <w:rFonts w:ascii="Times New Roman" w:hAnsi="Times New Roman" w:eastAsia="Times New Roman" w:cs="Times New Roman"/>
+        </w:rPr>
+        <w:t>helpline-cyber-cid@gujarat.gov.in</w:t>
+      </w:r>
+      <w:r>
+        <w:rPr>
+          <w:rStyle w:val="15"/>
+          <w:rFonts w:ascii="Times New Roman" w:hAnsi="Times New Roman" w:eastAsia="Times New Roman" w:cs="Times New Roman"/>
+        </w:rPr>
+        <w:fldChar w:fldCharType="end"/>
+      </w:r>
     </w:p>
     <w:p>
       <w:pPr>
@@ -195,14 +225,13 @@
       <w:r>
         <w:rPr>
           <w:rFonts w:ascii="Times New Roman" w:hAnsi="Times New Roman" w:cs="Times New Roman"/>
-          <w:noProof/>
           <w:sz w:val="2"/>
           <w:szCs w:val="2"/>
         </w:rPr>
         <mc:AlternateContent>
           <mc:Choice Requires="wps">
             <w:drawing>
-              <wp:anchor distT="0" distB="0" distL="114300" distR="114300" simplePos="0" relativeHeight="251660288" behindDoc="0" locked="0" layoutInCell="1" allowOverlap="1" wp14:anchorId="176E1D64" wp14:editId="766A4F21">
+              <wp:anchor distT="0" distB="0" distL="114300" distR="114300" simplePos="0" relativeHeight="251660288" behindDoc="0" locked="0" layoutInCell="1" allowOverlap="1">
                 <wp:simplePos x="0" y="0"/>
                 <wp:positionH relativeFrom="column">
                   <wp:posOffset>-279400</wp:posOffset>
@@ -250,7 +279,7 @@
               </wp:anchor>
             </w:drawing>
           </mc:Choice>
-          <mc:Fallback xmlns:wpsCustomData="http://www.wps.cn/officeDocument/2013/wpsCustomData">
+          <mc:Fallback>
             <w:pict>
               <v:line id="Straight Connector 1" o:spid="_x0000_s1026" o:spt="20" style="position:absolute;left:0pt;margin-left:-22pt;margin-top:5.85pt;height:0pt;width:512pt;z-index:251660288;mso-width-relative:page;mso-height-relative:page;" filled="f" stroked="t" coordsize="21600,21600" o:gfxdata="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">
                 <v:fill on="f" focussize="0,0"/>
@@ -266,7 +295,7 @@
     <w:p>
       <w:pPr>
         <w:tabs>
-          <w:tab w:pos="9144" w:val="right"/>
+          <w:tab w:val="right" w:pos="9144"/>
         </w:tabs>
         <w:spacing w:line="480" w:lineRule="auto"/>
         <w:ind w:left="-90" w:right="-784" w:hanging="360"/>
@@ -320,7 +349,7 @@
       </w:pPr>
       <w:r>
         <w:rPr>
-          <w:rFonts w:ascii="Times New Roman" w:eastAsia="Times New Roman" w:hAnsi="Times New Roman" w:cs="Times New Roman"/>
+          <w:rFonts w:ascii="Times New Roman" w:hAnsi="Times New Roman" w:eastAsia="Times New Roman" w:cs="Times New Roman"/>
           <w:b/>
           <w:bCs/>
           <w:color w:val="EE0000"/>
@@ -342,7 +371,7 @@
       </w:pPr>
       <w:r>
         <w:rPr>
-          <w:rFonts w:ascii="Times New Roman" w:eastAsia="Times New Roman" w:hAnsi="Times New Roman" w:cs="Times New Roman"/>
+          <w:rFonts w:ascii="Times New Roman" w:hAnsi="Times New Roman" w:eastAsia="Times New Roman" w:cs="Times New Roman"/>
           <w:sz w:val="24"/>
           <w:szCs w:val="24"/>
         </w:rPr>
@@ -360,7 +389,7 @@
       </w:pPr>
       <w:r>
         <w:rPr>
-          <w:rFonts w:ascii="Times New Roman" w:eastAsia="Times New Roman" w:hAnsi="Times New Roman" w:cs="Times New Roman"/>
+          <w:rFonts w:ascii="Times New Roman" w:hAnsi="Times New Roman" w:eastAsia="Times New Roman" w:cs="Times New Roman"/>
           <w:sz w:val="24"/>
           <w:szCs w:val="24"/>
           <w:lang w:val="en-US"/>
@@ -369,7 +398,7 @@
       </w:r>
       <w:r>
         <w:rPr>
-          <w:rFonts w:ascii="Times New Roman" w:eastAsia="Times New Roman" w:hAnsi="Times New Roman" w:cs="Times New Roman"/>
+          <w:rFonts w:ascii="Times New Roman" w:hAnsi="Times New Roman" w:eastAsia="Times New Roman" w:cs="Times New Roman"/>
           <w:sz w:val="24"/>
           <w:szCs w:val="24"/>
         </w:rPr>
@@ -387,7 +416,7 @@
       </w:pPr>
       <w:r>
         <w:rPr>
-          <w:rFonts w:ascii="Times New Roman" w:eastAsia="Times New Roman" w:hAnsi="Times New Roman" w:cs="Times New Roman"/>
+          <w:rFonts w:ascii="Times New Roman" w:hAnsi="Times New Roman" w:eastAsia="Times New Roman" w:cs="Times New Roman"/>
           <w:b/>
           <w:bCs/>
           <w:sz w:val="24"/>
@@ -397,7 +426,7 @@
       </w:r>
       <w:r>
         <w:rPr>
-          <w:rFonts w:ascii="Times New Roman" w:eastAsia="Times New Roman" w:hAnsi="Times New Roman" w:cs="Times New Roman"/>
+          <w:rFonts w:ascii="Times New Roman" w:hAnsi="Times New Roman" w:eastAsia="Times New Roman" w:cs="Times New Roman"/>
           <w:sz w:val="24"/>
           <w:szCs w:val="24"/>
         </w:rPr>
@@ -406,7 +435,8 @@
     </w:p>
     <w:p>
       <w:pPr>
-        <w:spacing w:before="80"/>
+        <w:spacing w:before="80" w:after="80" w:line="360" w:lineRule="auto"/>
+        <w:ind w:firstLine="720" w:firstLineChars="0"/>
         <w:jc w:val="both"/>
         <w:rPr>
           <w:rFonts w:ascii="Times New Roman" w:hAnsi="Times New Roman" w:cs="Times New Roman"/>
@@ -416,12 +446,21 @@
       </w:pPr>
       <w:r>
         <w:rPr>
-          <w:rFonts w:ascii="Times New Roman" w:eastAsia="Times New Roman" w:hAnsi="Times New Roman" w:cs="Times New Roman"/>
+          <w:rFonts w:ascii="Times New Roman" w:hAnsi="Times New Roman" w:eastAsia="Times New Roman" w:cs="Times New Roman"/>
           <w:sz w:val="24"/>
           <w:szCs w:val="24"/>
         </w:rPr>
         <w:tab/>
-        <w:t>This office has received an intimation through NCCRP regarding a suspicious/fraudulent transaction linked to the bank account(s) mentioned below. In this connection, you are hereby directed to furnish the Know Your Customer (KYC) details — including Name, Address, and Mobile Number — of the concerned account holder(s) at the earliest.</w:t>
+      </w:r>
+      <w:r>
+        <w:rPr>
+          <w:rFonts w:hint="default" w:ascii="Times New Roman" w:hAnsi="Times New Roman" w:eastAsia="Times New Roman" w:cs="Times New Roman"/>
+          <w:b w:val="0"/>
+          <w:bCs w:val="0"/>
+          <w:sz w:val="24"/>
+          <w:szCs w:val="24"/>
+        </w:rPr>
+        <w:t>This office has received an intimation through the NCCRP regarding a suspicious/fraudulent transaction linked to the bank account(s) mentioned below. In this connection, you are hereby directed to furnish only the Name, Address, and Mobile Number of the concerned account holder(s). The requested details may kindly be filled in the provided Excel file and furnished at the earliest.</w:t>
       </w:r>
     </w:p>
     <w:p>
@@ -435,7 +474,7 @@
       </w:pPr>
       <w:r>
         <w:rPr>
-          <w:rFonts w:ascii="Times New Roman" w:eastAsia="Times New Roman" w:hAnsi="Times New Roman" w:cs="Times New Roman"/>
+          <w:rFonts w:ascii="Times New Roman" w:hAnsi="Times New Roman" w:eastAsia="Times New Roman" w:cs="Times New Roman"/>
           <w:b/>
           <w:bCs/>
           <w:sz w:val="24"/>
@@ -446,21 +485,24 @@
     </w:p>
     <w:tbl>
       <w:tblPr>
+        <w:tblStyle w:val="12"/>
         <w:tblW w:w="9781" w:type="dxa"/>
         <w:tblInd w:w="-143" w:type="dxa"/>
         <w:tblBorders>
-          <w:top w:val="single" w:sz="4" w:space="0" w:color="auto"/>
-          <w:left w:val="single" w:sz="4" w:space="0" w:color="auto"/>
-          <w:bottom w:val="single" w:sz="4" w:space="0" w:color="auto"/>
-          <w:right w:val="single" w:sz="4" w:space="0" w:color="auto"/>
-          <w:insideH w:val="single" w:sz="4" w:space="0" w:color="auto"/>
-          <w:insideV w:val="single" w:sz="4" w:space="0" w:color="auto"/>
+          <w:top w:val="single" w:color="auto" w:sz="4" w:space="0"/>
+          <w:left w:val="single" w:color="auto" w:sz="4" w:space="0"/>
+          <w:bottom w:val="single" w:color="auto" w:sz="4" w:space="0"/>
+          <w:right w:val="single" w:color="auto" w:sz="4" w:space="0"/>
+          <w:insideH w:val="single" w:color="auto" w:sz="4" w:space="0"/>
+          <w:insideV w:val="single" w:color="auto" w:sz="4" w:space="0"/>
         </w:tblBorders>
+        <w:tblLayout w:type="autofit"/>
         <w:tblCellMar>
+          <w:top w:w="0" w:type="dxa"/>
           <w:left w:w="10" w:type="dxa"/>
+          <w:bottom w:w="0" w:type="dxa"/>
           <w:right w:w="10" w:type="dxa"/>
         </w:tblCellMar>
-        <w:tblLook w:val="04A0" w:firstRow="1" w:lastRow="0" w:firstColumn="1" w:lastColumn="0" w:noHBand="0" w:noVBand="1"/>
       </w:tblPr>
       <w:tblGrid>
         <w:gridCol w:w="684"/>
@@ -469,18 +511,34 @@
         <w:gridCol w:w="3351"/>
       </w:tblGrid>
       <w:tr>
+        <w:tblPrEx>
+          <w:tblBorders>
+            <w:top w:val="single" w:color="auto" w:sz="4" w:space="0"/>
+            <w:left w:val="single" w:color="auto" w:sz="4" w:space="0"/>
+            <w:bottom w:val="single" w:color="auto" w:sz="4" w:space="0"/>
+            <w:right w:val="single" w:color="auto" w:sz="4" w:space="0"/>
+            <w:insideH w:val="single" w:color="auto" w:sz="4" w:space="0"/>
+            <w:insideV w:val="single" w:color="auto" w:sz="4" w:space="0"/>
+          </w:tblBorders>
+          <w:tblCellMar>
+            <w:top w:w="0" w:type="dxa"/>
+            <w:left w:w="10" w:type="dxa"/>
+            <w:bottom w:w="0" w:type="dxa"/>
+            <w:right w:w="10" w:type="dxa"/>
+          </w:tblCellMar>
+        </w:tblPrEx>
         <w:trPr>
           <w:cantSplit/>
-          <w:trHeight w:val="950"/>
+          <w:trHeight w:val="950" w:hRule="atLeast"/>
         </w:trPr>
         <w:tc>
           <w:tcPr>
             <w:tcW w:w="684" w:type="dxa"/>
             <w:tcBorders>
-              <w:top w:val="single" w:sz="0" w:space="0" w:color="000000"/>
-              <w:left w:val="single" w:sz="0" w:space="0" w:color="000000"/>
-              <w:bottom w:val="single" w:sz="0" w:space="0" w:color="000000"/>
-              <w:right w:val="single" w:sz="0" w:space="0" w:color="000000"/>
+              <w:top w:val="single" w:color="000000" w:sz="0" w:space="0"/>
+              <w:left w:val="single" w:color="000000" w:sz="0" w:space="0"/>
+              <w:bottom w:val="single" w:color="000000" w:sz="0" w:space="0"/>
+              <w:right w:val="single" w:color="000000" w:sz="0" w:space="0"/>
             </w:tcBorders>
             <w:shd w:val="clear" w:color="auto" w:fill="D9D9D9"/>
           </w:tcPr>
@@ -488,7 +546,7 @@
             <w:pPr>
               <w:jc w:val="center"/>
               <w:rPr>
-                <w:rFonts w:ascii="Times New Roman" w:eastAsia="Times New Roman" w:hAnsi="Times New Roman" w:cs="Times New Roman"/>
+                <w:rFonts w:ascii="Times New Roman" w:hAnsi="Times New Roman" w:eastAsia="Times New Roman" w:cs="Times New Roman"/>
                 <w:b/>
                 <w:bCs/>
                 <w:sz w:val="24"/>
@@ -497,7 +555,7 @@
             </w:pPr>
             <w:r>
               <w:rPr>
-                <w:rFonts w:ascii="Times New Roman" w:eastAsia="Times New Roman" w:hAnsi="Times New Roman" w:cs="Times New Roman"/>
+                <w:rFonts w:ascii="Times New Roman" w:hAnsi="Times New Roman" w:eastAsia="Times New Roman" w:cs="Times New Roman"/>
                 <w:b/>
                 <w:bCs/>
                 <w:sz w:val="24"/>
@@ -510,7 +568,7 @@
             <w:pPr>
               <w:jc w:val="center"/>
               <w:rPr>
-                <w:rFonts w:ascii="Times New Roman" w:eastAsia="Times New Roman" w:hAnsi="Times New Roman" w:cs="Times New Roman"/>
+                <w:rFonts w:ascii="Times New Roman" w:hAnsi="Times New Roman" w:eastAsia="Times New Roman" w:cs="Times New Roman"/>
                 <w:b/>
                 <w:bCs/>
                 <w:sz w:val="24"/>
@@ -519,7 +577,7 @@
             </w:pPr>
             <w:r>
               <w:rPr>
-                <w:rFonts w:ascii="Times New Roman" w:eastAsia="Times New Roman" w:hAnsi="Times New Roman" w:cs="Times New Roman"/>
+                <w:rFonts w:ascii="Times New Roman" w:hAnsi="Times New Roman" w:eastAsia="Times New Roman" w:cs="Times New Roman"/>
                 <w:b/>
                 <w:bCs/>
                 <w:sz w:val="24"/>
@@ -533,10 +591,10 @@
           <w:tcPr>
             <w:tcW w:w="1660" w:type="dxa"/>
             <w:tcBorders>
-              <w:top w:val="single" w:sz="0" w:space="0" w:color="000000"/>
-              <w:left w:val="single" w:sz="0" w:space="0" w:color="000000"/>
-              <w:bottom w:val="single" w:sz="0" w:space="0" w:color="000000"/>
-              <w:right w:val="single" w:sz="0" w:space="0" w:color="000000"/>
+              <w:top w:val="single" w:color="000000" w:sz="0" w:space="0"/>
+              <w:left w:val="single" w:color="000000" w:sz="0" w:space="0"/>
+              <w:bottom w:val="single" w:color="000000" w:sz="0" w:space="0"/>
+              <w:right w:val="single" w:color="000000" w:sz="0" w:space="0"/>
             </w:tcBorders>
             <w:shd w:val="clear" w:color="auto" w:fill="D9D9D9"/>
             <w:tcMar>
@@ -557,7 +615,7 @@
             </w:pPr>
             <w:r>
               <w:rPr>
-                <w:rFonts w:ascii="Times New Roman" w:eastAsia="Times New Roman" w:hAnsi="Times New Roman" w:cs="Times New Roman"/>
+                <w:rFonts w:ascii="Times New Roman" w:hAnsi="Times New Roman" w:eastAsia="Times New Roman" w:cs="Times New Roman"/>
                 <w:b/>
                 <w:bCs/>
                 <w:sz w:val="24"/>
@@ -571,10 +629,10 @@
           <w:tcPr>
             <w:tcW w:w="4086" w:type="dxa"/>
             <w:tcBorders>
-              <w:top w:val="single" w:sz="0" w:space="0" w:color="000000"/>
-              <w:left w:val="single" w:sz="0" w:space="0" w:color="000000"/>
-              <w:bottom w:val="single" w:sz="0" w:space="0" w:color="000000"/>
-              <w:right w:val="single" w:sz="0" w:space="0" w:color="000000"/>
+              <w:top w:val="single" w:color="000000" w:sz="0" w:space="0"/>
+              <w:left w:val="single" w:color="000000" w:sz="0" w:space="0"/>
+              <w:bottom w:val="single" w:color="000000" w:sz="0" w:space="0"/>
+              <w:right w:val="single" w:color="000000" w:sz="0" w:space="0"/>
             </w:tcBorders>
             <w:shd w:val="clear" w:color="auto" w:fill="D9D9D9"/>
             <w:tcMar>
@@ -595,7 +653,7 @@
             </w:pPr>
             <w:r>
               <w:rPr>
-                <w:rFonts w:ascii="Times New Roman" w:eastAsia="Times New Roman" w:hAnsi="Times New Roman" w:cs="Times New Roman"/>
+                <w:rFonts w:ascii="Times New Roman" w:hAnsi="Times New Roman" w:eastAsia="Times New Roman" w:cs="Times New Roman"/>
                 <w:b/>
                 <w:bCs/>
                 <w:sz w:val="24"/>
@@ -609,10 +667,10 @@
           <w:tcPr>
             <w:tcW w:w="3351" w:type="dxa"/>
             <w:tcBorders>
-              <w:top w:val="single" w:sz="0" w:space="0" w:color="000000"/>
-              <w:left w:val="single" w:sz="0" w:space="0" w:color="000000"/>
-              <w:bottom w:val="single" w:sz="0" w:space="0" w:color="000000"/>
-              <w:right w:val="single" w:sz="0" w:space="0" w:color="000000"/>
+              <w:top w:val="single" w:color="000000" w:sz="0" w:space="0"/>
+              <w:left w:val="single" w:color="000000" w:sz="0" w:space="0"/>
+              <w:bottom w:val="single" w:color="000000" w:sz="0" w:space="0"/>
+              <w:right w:val="single" w:color="000000" w:sz="0" w:space="0"/>
             </w:tcBorders>
             <w:shd w:val="clear" w:color="auto" w:fill="D9D9D9"/>
             <w:tcMar>
@@ -633,7 +691,7 @@
             </w:pPr>
             <w:r>
               <w:rPr>
-                <w:rFonts w:ascii="Times New Roman" w:eastAsia="Times New Roman" w:hAnsi="Times New Roman" w:cs="Times New Roman"/>
+                <w:rFonts w:ascii="Times New Roman" w:hAnsi="Times New Roman" w:eastAsia="Times New Roman" w:cs="Times New Roman"/>
                 <w:b/>
                 <w:bCs/>
                 <w:sz w:val="24"/>
@@ -645,18 +703,34 @@
         </w:tc>
       </w:tr>
       <w:tr>
+        <w:tblPrEx>
+          <w:tblBorders>
+            <w:top w:val="single" w:color="auto" w:sz="4" w:space="0"/>
+            <w:left w:val="single" w:color="auto" w:sz="4" w:space="0"/>
+            <w:bottom w:val="single" w:color="auto" w:sz="4" w:space="0"/>
+            <w:right w:val="single" w:color="auto" w:sz="4" w:space="0"/>
+            <w:insideH w:val="single" w:color="auto" w:sz="4" w:space="0"/>
+            <w:insideV w:val="single" w:color="auto" w:sz="4" w:space="0"/>
+          </w:tblBorders>
+          <w:tblCellMar>
+            <w:top w:w="0" w:type="dxa"/>
+            <w:left w:w="10" w:type="dxa"/>
+            <w:bottom w:w="0" w:type="dxa"/>
+            <w:right w:w="10" w:type="dxa"/>
+          </w:tblCellMar>
+        </w:tblPrEx>
         <w:trPr>
           <w:cantSplit/>
-          <w:trHeight w:val="372"/>
+          <w:trHeight w:val="372" w:hRule="atLeast"/>
         </w:trPr>
         <w:tc>
           <w:tcPr>
             <w:tcW w:w="684" w:type="dxa"/>
             <w:tcBorders>
-              <w:top w:val="single" w:sz="0" w:space="0" w:color="000000"/>
-              <w:left w:val="single" w:sz="0" w:space="0" w:color="000000"/>
-              <w:bottom w:val="single" w:sz="0" w:space="0" w:color="000000"/>
-              <w:right w:val="single" w:sz="0" w:space="0" w:color="000000"/>
+              <w:top w:val="single" w:color="000000" w:sz="0" w:space="0"/>
+              <w:left w:val="single" w:color="000000" w:sz="0" w:space="0"/>
+              <w:bottom w:val="single" w:color="000000" w:sz="0" w:space="0"/>
+              <w:right w:val="single" w:color="000000" w:sz="0" w:space="0"/>
             </w:tcBorders>
             <w:vAlign w:val="center"/>
           </w:tcPr>
@@ -681,10 +755,10 @@
           <w:tcPr>
             <w:tcW w:w="1660" w:type="dxa"/>
             <w:tcBorders>
-              <w:top w:val="single" w:sz="0" w:space="0" w:color="000000"/>
-              <w:left w:val="single" w:sz="0" w:space="0" w:color="000000"/>
-              <w:bottom w:val="single" w:sz="0" w:space="0" w:color="000000"/>
-              <w:right w:val="single" w:sz="0" w:space="0" w:color="000000"/>
+              <w:top w:val="single" w:color="000000" w:sz="0" w:space="0"/>
+              <w:left w:val="single" w:color="000000" w:sz="0" w:space="0"/>
+              <w:bottom w:val="single" w:color="000000" w:sz="0" w:space="0"/>
+              <w:right w:val="single" w:color="000000" w:sz="0" w:space="0"/>
             </w:tcBorders>
             <w:tcMar>
               <w:top w:w="80" w:type="dxa"/>
@@ -715,10 +789,10 @@
           <w:tcPr>
             <w:tcW w:w="4086" w:type="dxa"/>
             <w:tcBorders>
-              <w:top w:val="single" w:sz="0" w:space="0" w:color="000000"/>
-              <w:left w:val="single" w:sz="0" w:space="0" w:color="000000"/>
-              <w:bottom w:val="single" w:sz="0" w:space="0" w:color="000000"/>
-              <w:right w:val="single" w:sz="0" w:space="0" w:color="000000"/>
+              <w:top w:val="single" w:color="000000" w:sz="0" w:space="0"/>
+              <w:left w:val="single" w:color="000000" w:sz="0" w:space="0"/>
+              <w:bottom w:val="single" w:color="000000" w:sz="0" w:space="0"/>
+              <w:right w:val="single" w:color="000000" w:sz="0" w:space="0"/>
             </w:tcBorders>
             <w:tcMar>
               <w:top w:w="80" w:type="dxa"/>
@@ -749,10 +823,10 @@
           <w:tcPr>
             <w:tcW w:w="3351" w:type="dxa"/>
             <w:tcBorders>
-              <w:top w:val="single" w:sz="0" w:space="0" w:color="000000"/>
-              <w:left w:val="single" w:sz="0" w:space="0" w:color="000000"/>
-              <w:bottom w:val="single" w:sz="0" w:space="0" w:color="000000"/>
-              <w:right w:val="single" w:sz="0" w:space="0" w:color="000000"/>
+              <w:top w:val="single" w:color="000000" w:sz="0" w:space="0"/>
+              <w:left w:val="single" w:color="000000" w:sz="0" w:space="0"/>
+              <w:bottom w:val="single" w:color="000000" w:sz="0" w:space="0"/>
+              <w:right w:val="single" w:color="000000" w:sz="0" w:space="0"/>
             </w:tcBorders>
             <w:tcMar>
               <w:top w:w="80" w:type="dxa"/>
@@ -788,7 +862,7 @@
         <w:spacing w:before="80" w:after="120"/>
         <w:jc w:val="both"/>
         <w:rPr>
-          <w:rFonts w:ascii="Times New Roman" w:eastAsia="Times New Roman" w:hAnsi="Times New Roman" w:cs="Times New Roman"/>
+          <w:rFonts w:ascii="Times New Roman" w:hAnsi="Times New Roman" w:eastAsia="Times New Roman" w:cs="Times New Roman"/>
           <w:sz w:val="24"/>
           <w:szCs w:val="24"/>
         </w:rPr>
@@ -808,7 +882,7 @@
       </w:pPr>
       <w:r>
         <w:rPr>
-          <w:rFonts w:ascii="Times New Roman" w:eastAsia="Times New Roman" w:hAnsi="Times New Roman" w:cs="Times New Roman"/>
+          <w:rFonts w:ascii="Times New Roman" w:hAnsi="Times New Roman" w:eastAsia="Times New Roman" w:cs="Times New Roman"/>
           <w:sz w:val="24"/>
           <w:szCs w:val="24"/>
         </w:rPr>
@@ -822,7 +896,7 @@
         <w:spacing w:after="100" w:afterAutospacing="1" w:line="240" w:lineRule="auto"/>
         <w:jc w:val="both"/>
         <w:rPr>
-          <w:rFonts w:ascii="Times New Roman" w:eastAsia="Times New Roman" w:hAnsi="Times New Roman" w:cs="Times New Roman"/>
+          <w:rFonts w:ascii="Times New Roman" w:hAnsi="Times New Roman" w:eastAsia="Times New Roman" w:cs="Times New Roman"/>
           <w:b/>
           <w:bCs/>
           <w:spacing w:val="5"/>
@@ -830,16 +904,17 @@
           <w:szCs w:val="24"/>
         </w:rPr>
       </w:pPr>
-      <w:r>
-        <w:rPr>
-          <w:rFonts w:ascii="Times New Roman" w:eastAsia="Times New Roman" w:hAnsi="Times New Roman" w:cs="Times New Roman"/>
-          <w:noProof/>
+      <w:bookmarkStart w:id="0" w:name="_GoBack"/>
+      <w:bookmarkEnd w:id="0"/>
+      <w:r>
+        <w:rPr>
+          <w:rFonts w:ascii="Times New Roman" w:hAnsi="Times New Roman" w:eastAsia="Times New Roman" w:cs="Times New Roman"/>
           <w:spacing w:val="5"/>
           <w:sz w:val="24"/>
           <w:szCs w:val="24"/>
         </w:rPr>
         <w:drawing>
-          <wp:anchor distT="0" distB="0" distL="114300" distR="114300" simplePos="0" relativeHeight="251661312" behindDoc="0" locked="0" layoutInCell="1" allowOverlap="1" wp14:anchorId="676AA1F7" wp14:editId="00D4800A">
+          <wp:anchor distT="0" distB="0" distL="114300" distR="114300" simplePos="0" relativeHeight="251661312" behindDoc="0" locked="0" layoutInCell="1" allowOverlap="1">
             <wp:simplePos x="0" y="0"/>
             <wp:positionH relativeFrom="column">
               <wp:posOffset>3155950</wp:posOffset>
@@ -864,7 +939,7 @@
                     </pic:cNvPicPr>
                   </pic:nvPicPr>
                   <pic:blipFill>
-                    <a:blip r:embed="rId10">
+                    <a:blip r:embed="rId7">
                       <a:extLst>
                         <a:ext uri="{28A0092B-C50C-407E-A947-70E740481C1C}">
                           <a14:useLocalDpi xmlns:a14="http://schemas.microsoft.com/office/drawing/2010/main" val="0"/>
@@ -903,7 +978,7 @@
         <w:spacing w:after="100" w:afterAutospacing="1" w:line="240" w:lineRule="auto"/>
         <w:jc w:val="both"/>
         <w:rPr>
-          <w:rFonts w:ascii="Times New Roman" w:eastAsia="Times New Roman" w:hAnsi="Times New Roman" w:cs="Times New Roman"/>
+          <w:rFonts w:ascii="Times New Roman" w:hAnsi="Times New Roman" w:eastAsia="Times New Roman" w:cs="Times New Roman"/>
           <w:b/>
           <w:bCs/>
           <w:spacing w:val="5"/>
@@ -922,7 +997,7 @@
         <w:ind w:left="3960" w:hanging="360"/>
         <w:jc w:val="center"/>
         <w:rPr>
-          <w:rFonts w:ascii="Times New Roman" w:eastAsia="Times New Roman" w:hAnsi="Times New Roman" w:cs="Times New Roman"/>
+          <w:rFonts w:ascii="Times New Roman" w:hAnsi="Times New Roman" w:eastAsia="Times New Roman" w:cs="Times New Roman"/>
           <w:b/>
           <w:bCs/>
           <w:spacing w:val="5"/>
@@ -932,7 +1007,7 @@
       </w:pPr>
       <w:r>
         <w:rPr>
-          <w:rFonts w:ascii="Times New Roman" w:eastAsia="Times New Roman" w:hAnsi="Times New Roman" w:cs="Times New Roman"/>
+          <w:rFonts w:ascii="Times New Roman" w:hAnsi="Times New Roman" w:eastAsia="Times New Roman" w:cs="Times New Roman"/>
           <w:b/>
           <w:bCs/>
           <w:spacing w:val="5"/>
@@ -956,7 +1031,7 @@
       </w:pPr>
       <w:r>
         <w:rPr>
-          <w:rFonts w:ascii="Times New Roman" w:eastAsia="Times New Roman" w:hAnsi="Times New Roman" w:cs="Times New Roman"/>
+          <w:rFonts w:ascii="Times New Roman" w:hAnsi="Times New Roman" w:eastAsia="Times New Roman" w:cs="Times New Roman"/>
           <w:b/>
           <w:bCs/>
           <w:spacing w:val="5"/>
@@ -967,48 +1042,72 @@
       </w:r>
       <w:r>
         <w:rPr>
-          <w:rFonts w:ascii="Times New Roman" w:eastAsia="Times New Roman" w:hAnsi="Times New Roman" w:cs="Times New Roman"/>
+          <w:rFonts w:ascii="Times New Roman" w:hAnsi="Times New Roman" w:eastAsia="Times New Roman" w:cs="Times New Roman"/>
           <w:spacing w:val="5"/>
           <w:sz w:val="24"/>
           <w:szCs w:val="24"/>
         </w:rPr>
-        <w:br/>
+        <w:br w:type="textWrapping"/>
+      </w:r>
+      <w:r>
+        <w:rPr>
+          <w:rFonts w:ascii="Times New Roman" w:hAnsi="Times New Roman" w:eastAsia="Times New Roman" w:cs="Times New Roman"/>
+          <w:spacing w:val="5"/>
+          <w:sz w:val="24"/>
+          <w:szCs w:val="24"/>
+        </w:rPr>
         <w:t xml:space="preserve">                     Superintendent of Police,</w:t>
       </w:r>
       <w:r>
         <w:rPr>
-          <w:rFonts w:ascii="Times New Roman" w:eastAsia="Times New Roman" w:hAnsi="Times New Roman" w:cs="Times New Roman"/>
+          <w:rFonts w:ascii="Times New Roman" w:hAnsi="Times New Roman" w:eastAsia="Times New Roman" w:cs="Times New Roman"/>
           <w:spacing w:val="5"/>
           <w:sz w:val="24"/>
           <w:szCs w:val="24"/>
         </w:rPr>
-        <w:br/>
+        <w:br w:type="textWrapping"/>
+      </w:r>
+      <w:r>
+        <w:rPr>
+          <w:rFonts w:ascii="Times New Roman" w:hAnsi="Times New Roman" w:eastAsia="Times New Roman" w:cs="Times New Roman"/>
+          <w:spacing w:val="5"/>
+          <w:sz w:val="24"/>
+          <w:szCs w:val="24"/>
+        </w:rPr>
         <w:t xml:space="preserve">                     Cyber Center of Excellence,</w:t>
       </w:r>
       <w:r>
         <w:rPr>
-          <w:rFonts w:ascii="Times New Roman" w:eastAsia="Times New Roman" w:hAnsi="Times New Roman" w:cs="Times New Roman"/>
+          <w:rFonts w:ascii="Times New Roman" w:hAnsi="Times New Roman" w:eastAsia="Times New Roman" w:cs="Times New Roman"/>
           <w:spacing w:val="5"/>
           <w:sz w:val="24"/>
           <w:szCs w:val="24"/>
         </w:rPr>
-        <w:br/>
+        <w:br w:type="textWrapping"/>
+      </w:r>
+      <w:r>
+        <w:rPr>
+          <w:rFonts w:ascii="Times New Roman" w:hAnsi="Times New Roman" w:eastAsia="Times New Roman" w:cs="Times New Roman"/>
+          <w:spacing w:val="5"/>
+          <w:sz w:val="24"/>
+          <w:szCs w:val="24"/>
+        </w:rPr>
         <w:t xml:space="preserve">                      Gandhinagar, Gujarat State.</w:t>
       </w:r>
     </w:p>
     <w:sectPr>
       <w:pgSz w:w="11906" w:h="16838"/>
       <w:pgMar w:top="360" w:right="1106" w:bottom="630" w:left="1440" w:header="708" w:footer="708" w:gutter="0"/>
-      <w:cols w:space="708"/>
-      <w:docGrid w:linePitch="360"/>
+      <w:cols w:space="708" w:num="1"/>
+      <w:docGrid w:linePitch="360" w:charSpace="0"/>
     </w:sectPr>
   </w:body>
 </w:document>
 </file>
 
 <file path=word/endnotes.xml><?xml version="1.0" encoding="utf-8"?>
-<w:endnotes xmlns:wpc="http://schemas.microsoft.com/office/word/2010/wordprocessingCanvas" xmlns:cx="http://schemas.microsoft.com/office/drawing/2014/chartex" xmlns:cx1="http://schemas.microsoft.com/office/drawing/2015/9/8/chartex" xmlns:cx2="http://schemas.microsoft.com/office/drawing/2015/10/21/chartex" xmlns:cx3="http://schemas.microsoft.com/office/drawing/2016/5/9/chartex" xmlns:cx4="http://schemas.microsoft.com/office/drawing/2016/5/10/chartex" xmlns:cx5="http://schemas.microsoft.com/office/drawing/2016/5/11/chartex" xmlns:cx6="http://schemas.microsoft.com/office/drawing/2016/5/12/chartex" xmlns:cx7="http://schemas.microsoft.com/office/drawing/2016/5/13/chartex" xmlns:cx8="http://schemas.microsoft.com/office/drawing/2016/5/14/chartex" xmlns:mc="http://schemas.openxmlformats.org/markup-compatibility/2006" xmlns:aink="http://schemas.microsoft.com/office/drawing/2016/ink" xmlns:am3d="http://schemas.microsoft.com/office/drawing/2017/model3d" xmlns:o="urn:schemas-microsoft-com:office:office" xmlns:oel="http://schemas.microsoft.com/office/2019/extlst" xmlns:r="http://schemas.openxmlformats.org/officeDocument/2006/relationships" xmlns:m="http://schemas.openxmlformats.org/officeDocument/2006/math" xmlns:v="urn:schemas-microsoft-com:vml" xmlns:wp14="http://schemas.microsoft.com/office/word/2010/wordprocessingDrawing" xmlns:wp="http://schemas.openxmlformats.org/drawingml/2006/wordprocessingDrawing" xmlns:w10="urn:schemas-microsoft-com:office:word" xmlns:w="http://schemas.openxmlformats.org/wordprocessingml/2006/main" xmlns:w14="http://schemas.microsoft.com/office/word/2010/wordml" xmlns:w15="http://schemas.microsoft.com/office/word/2012/wordml" xmlns:w16cex="http://schemas.microsoft.com/office/word/2018/wordml/cex" xmlns:w16cid="http://schemas.microsoft.com/office/word/2016/wordml/cid" xmlns:w16="http://schemas.microsoft.com/office/word/2018/wordml" xmlns:w16du="http://schemas.microsoft.com/office/word/2023/wordml/word16du" xmlns:w16sdtdh="http://schemas.microsoft.com/office/word/2020/wordml/sdtdatahash" xmlns:w16sdtfl="http://schemas.microsoft.com/office/word/2024/wordml/sdtformatlock" xmlns:w16se="http://schemas.microsoft.com/office/word/2015/wordml/symex" xmlns:wpg="http://schemas.microsoft.com/office/word/2010/wordprocessingGroup" xmlns:wpi="http://schemas.microsoft.com/office/word/2010/wordprocessingInk" xmlns:wne="http://schemas.microsoft.com/office/word/2006/wordml" xmlns:wps="http://schemas.microsoft.com/office/word/2010/wordprocessingShape" mc:Ignorable="w14 w15 w16se w16cid w16 w16cex w16sdtdh w16sdtfl w16du wp14">
-  <w:endnote w:type="separator" w:id="-1">
+<w:endnotes xmlns:wpc="http://schemas.microsoft.com/office/word/2010/wordprocessingCanvas" xmlns:mc="http://schemas.openxmlformats.org/markup-compatibility/2006" xmlns:o="urn:schemas-microsoft-com:office:office" xmlns:r="http://schemas.openxmlformats.org/officeDocument/2006/relationships" xmlns:m="http://schemas.openxmlformats.org/officeDocument/2006/math" xmlns:v="urn:schemas-microsoft-com:vml" xmlns:wp14="http://schemas.microsoft.com/office/word/2010/wordprocessingDrawing" xmlns:wp="http://schemas.openxmlformats.org/drawingml/2006/wordprocessingDrawing" xmlns:w="http://schemas.openxmlformats.org/wordprocessingml/2006/main" xmlns:w14="http://schemas.microsoft.com/office/word/2010/wordml" xmlns:w15="http://schemas.microsoft.com/office/word/2012/wordml" xmlns:w10="urn:schemas-microsoft-com:office:word" xmlns:wpg="http://schemas.microsoft.com/office/word/2010/wordprocessingGroup" xmlns:wpi="http://schemas.microsoft.com/office/word/2010/wordprocessingInk" xmlns:wne="http://schemas.microsoft.com/office/word/2006/wordml" xmlns:wps="http://schemas.microsoft.com/office/word/2010/wordprocessingShape" xmlns:wpsCustomData="http://www.wps.cn/officeDocument/2013/wpsCustomData" mc:Ignorable="w14 w15 wp14">
+  <w:endnote w:type="separator" w:id="0">
     <w:p>
       <w:pPr>
         <w:spacing w:line="240" w:lineRule="auto"/>
@@ -1018,7 +1117,7 @@
       </w:r>
     </w:p>
   </w:endnote>
-  <w:endnote w:type="continuationSeparator" w:id="0">
+  <w:endnote w:type="continuationSeparator" w:id="1">
     <w:p>
       <w:pPr>
         <w:spacing w:line="240" w:lineRule="auto"/>
@@ -1032,21 +1131,21 @@
 </file>
 
 <file path=word/footnotes.xml><?xml version="1.0" encoding="utf-8"?>
-<w:footnotes xmlns:wpc="http://schemas.microsoft.com/office/word/2010/wordprocessingCanvas" xmlns:cx="http://schemas.microsoft.com/office/drawing/2014/chartex" xmlns:cx1="http://schemas.microsoft.com/office/drawing/2015/9/8/chartex" xmlns:cx2="http://schemas.microsoft.com/office/drawing/2015/10/21/chartex" xmlns:cx3="http://schemas.microsoft.com/office/drawing/2016/5/9/chartex" xmlns:cx4="http://schemas.microsoft.com/office/drawing/2016/5/10/chartex" xmlns:cx5="http://schemas.microsoft.com/office/drawing/2016/5/11/chartex" xmlns:cx6="http://schemas.microsoft.com/office/drawing/2016/5/12/chartex" xmlns:cx7="http://schemas.microsoft.com/office/drawing/2016/5/13/chartex" xmlns:cx8="http://schemas.microsoft.com/office/drawing/2016/5/14/chartex" xmlns:mc="http://schemas.openxmlformats.org/markup-compatibility/2006" xmlns:aink="http://schemas.microsoft.com/office/drawing/2016/ink" xmlns:am3d="http://schemas.microsoft.com/office/drawing/2017/model3d" xmlns:o="urn:schemas-microsoft-com:office:office" xmlns:oel="http://schemas.microsoft.com/office/2019/extlst" xmlns:r="http://schemas.openxmlformats.org/officeDocument/2006/relationships" xmlns:m="http://schemas.openxmlformats.org/officeDocument/2006/math" xmlns:v="urn:schemas-microsoft-com:vml" xmlns:wp14="http://schemas.microsoft.com/office/word/2010/wordprocessingDrawing" xmlns:wp="http://schemas.openxmlformats.org/drawingml/2006/wordprocessingDrawing" xmlns:w10="urn:schemas-microsoft-com:office:word" xmlns:w="http://schemas.openxmlformats.org/wordprocessingml/2006/main" xmlns:w14="http://schemas.microsoft.com/office/word/2010/wordml" xmlns:w15="http://schemas.microsoft.com/office/word/2012/wordml" xmlns:w16cex="http://schemas.microsoft.com/office/word/2018/wordml/cex" xmlns:w16cid="http://schemas.microsoft.com/office/word/2016/wordml/cid" xmlns:w16="http://schemas.microsoft.com/office/word/2018/wordml" xmlns:w16du="http://schemas.microsoft.com/office/word/2023/wordml/word16du" xmlns:w16sdtdh="http://schemas.microsoft.com/office/word/2020/wordml/sdtdatahash" xmlns:w16sdtfl="http://schemas.microsoft.com/office/word/2024/wordml/sdtformatlock" xmlns:w16se="http://schemas.microsoft.com/office/word/2015/wordml/symex" xmlns:wpg="http://schemas.microsoft.com/office/word/2010/wordprocessingGroup" xmlns:wpi="http://schemas.microsoft.com/office/word/2010/wordprocessingInk" xmlns:wne="http://schemas.microsoft.com/office/word/2006/wordml" xmlns:wps="http://schemas.microsoft.com/office/word/2010/wordprocessingShape" mc:Ignorable="w14 w15 w16se w16cid w16 w16cex w16sdtdh w16sdtfl w16du wp14">
-  <w:footnote w:type="separator" w:id="-1">
+<w:footnotes xmlns:wpc="http://schemas.microsoft.com/office/word/2010/wordprocessingCanvas" xmlns:mc="http://schemas.openxmlformats.org/markup-compatibility/2006" xmlns:o="urn:schemas-microsoft-com:office:office" xmlns:r="http://schemas.openxmlformats.org/officeDocument/2006/relationships" xmlns:m="http://schemas.openxmlformats.org/officeDocument/2006/math" xmlns:v="urn:schemas-microsoft-com:vml" xmlns:wp14="http://schemas.microsoft.com/office/word/2010/wordprocessingDrawing" xmlns:wp="http://schemas.openxmlformats.org/drawingml/2006/wordprocessingDrawing" xmlns:w="http://schemas.openxmlformats.org/wordprocessingml/2006/main" xmlns:w14="http://schemas.microsoft.com/office/word/2010/wordml" xmlns:w15="http://schemas.microsoft.com/office/word/2012/wordml" xmlns:w10="urn:schemas-microsoft-com:office:word" xmlns:wpg="http://schemas.microsoft.com/office/word/2010/wordprocessingGroup" xmlns:wpi="http://schemas.microsoft.com/office/word/2010/wordprocessingInk" xmlns:wne="http://schemas.microsoft.com/office/word/2006/wordml" xmlns:wps="http://schemas.microsoft.com/office/word/2010/wordprocessingShape" xmlns:wpsCustomData="http://www.wps.cn/officeDocument/2013/wpsCustomData" mc:Ignorable="w14 w15 wp14">
+  <w:footnote w:type="separator" w:id="0">
     <w:p>
       <w:pPr>
-        <w:spacing w:after="0"/>
+        <w:spacing w:before="0" w:after="0" w:line="259" w:lineRule="auto"/>
       </w:pPr>
       <w:r>
         <w:separator/>
       </w:r>
     </w:p>
   </w:footnote>
-  <w:footnote w:type="continuationSeparator" w:id="0">
+  <w:footnote w:type="continuationSeparator" w:id="1">
     <w:p>
       <w:pPr>
-        <w:spacing w:after="0"/>
+        <w:spacing w:before="0" w:after="0" w:line="259" w:lineRule="auto"/>
       </w:pPr>
       <w:r>
         <w:continuationSeparator/>
@@ -1056,511 +1155,292 @@
 </w:footnotes>
 </file>
 
-<file path=word/numbering.xml><?xml version="1.0" encoding="utf-8"?>
-<w:numbering xmlns:wpc="http://schemas.microsoft.com/office/word/2010/wordprocessingCanvas" xmlns:cx="http://schemas.microsoft.com/office/drawing/2014/chartex" xmlns:cx1="http://schemas.microsoft.com/office/drawing/2015/9/8/chartex" xmlns:cx2="http://schemas.microsoft.com/office/drawing/2015/10/21/chartex" xmlns:cx3="http://schemas.microsoft.com/office/drawing/2016/5/9/chartex" xmlns:cx4="http://schemas.microsoft.com/office/drawing/2016/5/10/chartex" xmlns:cx5="http://schemas.microsoft.com/office/drawing/2016/5/11/chartex" xmlns:cx6="http://schemas.microsoft.com/office/drawing/2016/5/12/chartex" xmlns:cx7="http://schemas.microsoft.com/office/drawing/2016/5/13/chartex" xmlns:cx8="http://schemas.microsoft.com/office/drawing/2016/5/14/chartex" xmlns:mc="http://schemas.openxmlformats.org/markup-compatibility/2006" xmlns:aink="http://schemas.microsoft.com/office/drawing/2016/ink" xmlns:am3d="http://schemas.microsoft.com/office/drawing/2017/model3d" xmlns:o="urn:schemas-microsoft-com:office:office" xmlns:oel="http://schemas.microsoft.com/office/2019/extlst" xmlns:r="http://schemas.openxmlformats.org/officeDocument/2006/relationships" xmlns:m="http://schemas.openxmlformats.org/officeDocument/2006/math" xmlns:v="urn:schemas-microsoft-com:vml" xmlns:wp14="http://schemas.microsoft.com/office/word/2010/wordprocessingDrawing" xmlns:wp="http://schemas.openxmlformats.org/drawingml/2006/wordprocessingDrawing" xmlns:w10="urn:schemas-microsoft-com:office:word" xmlns:w="http://schemas.openxmlformats.org/wordprocessingml/2006/main" xmlns:w14="http://schemas.microsoft.com/office/word/2010/wordml" xmlns:w15="http://schemas.microsoft.com/office/word/2012/wordml" xmlns:w16cex="http://schemas.microsoft.com/office/word/2018/wordml/cex" xmlns:w16cid="http://schemas.microsoft.com/office/word/2016/wordml/cid" xmlns:w16="http://schemas.microsoft.com/office/word/2018/wordml" xmlns:w16du="http://schemas.microsoft.com/office/word/2023/wordml/word16du" xmlns:w16sdtdh="http://schemas.microsoft.com/office/word/2020/wordml/sdtdatahash" xmlns:w16sdtfl="http://schemas.microsoft.com/office/word/2024/wordml/sdtformatlock" xmlns:w16se="http://schemas.microsoft.com/office/word/2015/wordml/symex" xmlns:wpg="http://schemas.microsoft.com/office/word/2010/wordprocessingGroup" xmlns:wpi="http://schemas.microsoft.com/office/word/2010/wordprocessingInk" xmlns:wne="http://schemas.microsoft.com/office/word/2006/wordml" xmlns:wps="http://schemas.microsoft.com/office/word/2010/wordprocessingShape" mc:Ignorable="w14 w15 w16se w16cid w16 w16cex w16sdtdh w16sdtfl w16du wp14">
-  <w:abstractNum w:abstractNumId="0" w15:restartNumberingAfterBreak="0">
-    <w:nsid w:val="7FDE37FF"/>
-    <w:multiLevelType w:val="multilevel"/>
-    <w:tmpl w:val="7FDE37FF"/>
-    <w:lvl w:ilvl="0">
-      <w:start w:val="1"/>
-      <w:numFmt w:val="decimal"/>
-      <w:lvlText w:val="%1."/>
-      <w:lvlJc w:val="left"/>
-      <w:pPr>
-        <w:ind w:left="720" w:hanging="360"/>
-      </w:pPr>
-    </w:lvl>
-    <w:lvl w:ilvl="1">
-      <w:start w:val="1"/>
-      <w:numFmt w:val="lowerLetter"/>
-      <w:lvlText w:val="%2."/>
-      <w:lvlJc w:val="left"/>
-      <w:pPr>
-        <w:ind w:left="1440" w:hanging="360"/>
-      </w:pPr>
-    </w:lvl>
-    <w:lvl w:ilvl="2">
-      <w:start w:val="1"/>
-      <w:numFmt w:val="lowerRoman"/>
-      <w:lvlText w:val="%3."/>
-      <w:lvlJc w:val="right"/>
-      <w:pPr>
-        <w:ind w:left="2160" w:hanging="180"/>
-      </w:pPr>
-    </w:lvl>
-    <w:lvl w:ilvl="3">
-      <w:start w:val="1"/>
-      <w:numFmt w:val="decimal"/>
-      <w:lvlText w:val="%4."/>
-      <w:lvlJc w:val="left"/>
-      <w:pPr>
-        <w:ind w:left="2880" w:hanging="360"/>
-      </w:pPr>
-    </w:lvl>
-    <w:lvl w:ilvl="4">
-      <w:start w:val="1"/>
-      <w:numFmt w:val="lowerLetter"/>
-      <w:lvlText w:val="%5."/>
-      <w:lvlJc w:val="left"/>
-      <w:pPr>
-        <w:ind w:left="3600" w:hanging="360"/>
-      </w:pPr>
-    </w:lvl>
-    <w:lvl w:ilvl="5">
-      <w:start w:val="1"/>
-      <w:numFmt w:val="lowerRoman"/>
-      <w:lvlText w:val="%6."/>
-      <w:lvlJc w:val="right"/>
-      <w:pPr>
-        <w:ind w:left="4320" w:hanging="180"/>
-      </w:pPr>
-    </w:lvl>
-    <w:lvl w:ilvl="6">
-      <w:start w:val="1"/>
-      <w:numFmt w:val="decimal"/>
-      <w:lvlText w:val="%7."/>
-      <w:lvlJc w:val="left"/>
-      <w:pPr>
-        <w:ind w:left="5040" w:hanging="360"/>
-      </w:pPr>
-    </w:lvl>
-    <w:lvl w:ilvl="7">
-      <w:start w:val="1"/>
-      <w:numFmt w:val="lowerLetter"/>
-      <w:lvlText w:val="%8."/>
-      <w:lvlJc w:val="left"/>
-      <w:pPr>
-        <w:ind w:left="5760" w:hanging="360"/>
-      </w:pPr>
-    </w:lvl>
-    <w:lvl w:ilvl="8">
-      <w:start w:val="1"/>
-      <w:numFmt w:val="lowerRoman"/>
-      <w:lvlText w:val="%9."/>
-      <w:lvlJc w:val="right"/>
-      <w:pPr>
-        <w:ind w:left="6480" w:hanging="180"/>
-      </w:pPr>
-    </w:lvl>
-  </w:abstractNum>
-  <w:num w:numId="1" w16cid:durableId="1226452947">
-    <w:abstractNumId w:val="0"/>
-  </w:num>
-</w:numbering>
-</file>
-
 <file path=word/styles.xml><?xml version="1.0" encoding="utf-8"?>
-<w:styles xmlns:mc="http://schemas.openxmlformats.org/markup-compatibility/2006" xmlns:r="http://schemas.openxmlformats.org/officeDocument/2006/relationships" xmlns:w="http://schemas.openxmlformats.org/wordprocessingml/2006/main" xmlns:w14="http://schemas.microsoft.com/office/word/2010/wordml" xmlns:w15="http://schemas.microsoft.com/office/word/2012/wordml" xmlns:w16cex="http://schemas.microsoft.com/office/word/2018/wordml/cex" xmlns:w16cid="http://schemas.microsoft.com/office/word/2016/wordml/cid" xmlns:w16="http://schemas.microsoft.com/office/word/2018/wordml" xmlns:w16du="http://schemas.microsoft.com/office/word/2023/wordml/word16du" xmlns:w16sdtdh="http://schemas.microsoft.com/office/word/2020/wordml/sdtdatahash" xmlns:w16sdtfl="http://schemas.microsoft.com/office/word/2024/wordml/sdtformatlock" xmlns:w16se="http://schemas.microsoft.com/office/word/2015/wordml/symex" mc:Ignorable="w14 w15 w16se w16cid w16 w16cex w16sdtdh w16sdtfl w16du">
+<w:styles xmlns:mc="http://schemas.openxmlformats.org/markup-compatibility/2006" xmlns:o="urn:schemas-microsoft-com:office:office" xmlns:r="http://schemas.openxmlformats.org/officeDocument/2006/relationships" xmlns:m="http://schemas.openxmlformats.org/officeDocument/2006/math" xmlns:v="urn:schemas-microsoft-com:vml" xmlns:w="http://schemas.openxmlformats.org/wordprocessingml/2006/main" xmlns:w14="http://schemas.microsoft.com/office/word/2010/wordml" xmlns:w10="urn:schemas-microsoft-com:office:word" xmlns:sl="http://schemas.openxmlformats.org/schemaLibrary/2006/main" xmlns:wpsCustomData="http://www.wps.cn/officeDocument/2013/wpsCustomData" mc:Ignorable="w14">
   <w:docDefaults>
     <w:rPrDefault>
       <w:rPr>
-        <w:rFonts w:ascii="Times New Roman" w:eastAsia="SimSun" w:hAnsi="Times New Roman" w:cs="Times New Roman"/>
-        <w:lang w:val="en-US" w:eastAsia="en-US" w:bidi="hi-IN"/>
+        <w:rFonts w:ascii="Times New Roman" w:hAnsi="Times New Roman" w:eastAsia="SimSun" w:cs="Times New Roman"/>
       </w:rPr>
     </w:rPrDefault>
     <w:pPrDefault/>
   </w:docDefaults>
-  <w:latentStyles w:defLockedState="0" w:defUIPriority="99" w:defSemiHidden="0" w:defUnhideWhenUsed="0" w:defQFormat="0" w:count="376">
-    <w:lsdException w:name="Normal" w:uiPriority="0" w:qFormat="1"/>
-    <w:lsdException w:name="heading 1" w:uiPriority="9" w:qFormat="1"/>
-    <w:lsdException w:name="heading 2" w:semiHidden="1" w:uiPriority="9" w:unhideWhenUsed="1" w:qFormat="1"/>
-    <w:lsdException w:name="heading 3" w:semiHidden="1" w:uiPriority="9" w:unhideWhenUsed="1" w:qFormat="1"/>
-    <w:lsdException w:name="heading 4" w:semiHidden="1" w:uiPriority="9" w:unhideWhenUsed="1" w:qFormat="1"/>
-    <w:lsdException w:name="heading 5" w:semiHidden="1" w:uiPriority="9" w:unhideWhenUsed="1" w:qFormat="1"/>
-    <w:lsdException w:name="heading 6" w:semiHidden="1" w:uiPriority="9" w:unhideWhenUsed="1" w:qFormat="1"/>
-    <w:lsdException w:name="heading 7" w:semiHidden="1" w:uiPriority="9" w:unhideWhenUsed="1" w:qFormat="1"/>
-    <w:lsdException w:name="heading 8" w:semiHidden="1" w:uiPriority="9" w:unhideWhenUsed="1" w:qFormat="1"/>
-    <w:lsdException w:name="heading 9" w:semiHidden="1" w:uiPriority="9" w:unhideWhenUsed="1" w:qFormat="1"/>
-    <w:lsdException w:name="index 1" w:semiHidden="1" w:unhideWhenUsed="1"/>
-    <w:lsdException w:name="index 2" w:semiHidden="1" w:unhideWhenUsed="1"/>
-    <w:lsdException w:name="index 3" w:semiHidden="1" w:unhideWhenUsed="1"/>
-    <w:lsdException w:name="index 4" w:semiHidden="1" w:unhideWhenUsed="1"/>
-    <w:lsdException w:name="index 5" w:semiHidden="1" w:unhideWhenUsed="1"/>
-    <w:lsdException w:name="index 6" w:semiHidden="1" w:unhideWhenUsed="1"/>
-    <w:lsdException w:name="index 7" w:semiHidden="1" w:unhideWhenUsed="1"/>
-    <w:lsdException w:name="index 8" w:semiHidden="1" w:unhideWhenUsed="1"/>
-    <w:lsdException w:name="index 9" w:semiHidden="1" w:unhideWhenUsed="1"/>
-    <w:lsdException w:name="toc 1" w:semiHidden="1" w:uiPriority="39" w:unhideWhenUsed="1"/>
-    <w:lsdException w:name="toc 2" w:semiHidden="1" w:uiPriority="39" w:unhideWhenUsed="1"/>
-    <w:lsdException w:name="toc 3" w:semiHidden="1" w:uiPriority="39" w:unhideWhenUsed="1"/>
-    <w:lsdException w:name="toc 4" w:semiHidden="1" w:uiPriority="39" w:unhideWhenUsed="1"/>
-    <w:lsdException w:name="toc 5" w:semiHidden="1" w:uiPriority="39" w:unhideWhenUsed="1"/>
-    <w:lsdException w:name="toc 6" w:semiHidden="1" w:uiPriority="39" w:unhideWhenUsed="1"/>
-    <w:lsdException w:name="toc 7" w:semiHidden="1" w:uiPriority="39" w:unhideWhenUsed="1"/>
-    <w:lsdException w:name="toc 8" w:semiHidden="1" w:uiPriority="39" w:unhideWhenUsed="1"/>
-    <w:lsdException w:name="toc 9" w:semiHidden="1" w:uiPriority="39" w:unhideWhenUsed="1"/>
-    <w:lsdException w:name="Normal Indent" w:semiHidden="1" w:unhideWhenUsed="1"/>
-    <w:lsdException w:name="footnote text" w:semiHidden="1" w:unhideWhenUsed="1"/>
-    <w:lsdException w:name="annotation text" w:semiHidden="1" w:unhideWhenUsed="1"/>
-    <w:lsdException w:name="header" w:unhideWhenUsed="1" w:qFormat="1"/>
-    <w:lsdException w:name="footer" w:unhideWhenUsed="1" w:qFormat="1"/>
-    <w:lsdException w:name="index heading" w:semiHidden="1" w:unhideWhenUsed="1"/>
-    <w:lsdException w:name="caption" w:semiHidden="1" w:uiPriority="35" w:unhideWhenUsed="1" w:qFormat="1"/>
-    <w:lsdException w:name="table of figures" w:semiHidden="1" w:unhideWhenUsed="1"/>
-    <w:lsdException w:name="envelope address" w:semiHidden="1" w:unhideWhenUsed="1"/>
-    <w:lsdException w:name="envelope return" w:semiHidden="1" w:unhideWhenUsed="1"/>
-    <w:lsdException w:name="footnote reference" w:semiHidden="1" w:unhideWhenUsed="1"/>
-    <w:lsdException w:name="annotation reference" w:semiHidden="1" w:unhideWhenUsed="1"/>
-    <w:lsdException w:name="line number" w:semiHidden="1" w:unhideWhenUsed="1"/>
-    <w:lsdException w:name="page number" w:semiHidden="1" w:unhideWhenUsed="1"/>
-    <w:lsdException w:name="endnote reference" w:semiHidden="1" w:unhideWhenUsed="1"/>
-    <w:lsdException w:name="endnote text" w:semiHidden="1" w:unhideWhenUsed="1"/>
-    <w:lsdException w:name="table of authorities" w:semiHidden="1" w:unhideWhenUsed="1"/>
-    <w:lsdException w:name="macro" w:semiHidden="1" w:unhideWhenUsed="1"/>
-    <w:lsdException w:name="toa heading" w:semiHidden="1" w:unhideWhenUsed="1"/>
-    <w:lsdException w:name="List" w:semiHidden="1" w:unhideWhenUsed="1"/>
-    <w:lsdException w:name="List Bullet" w:semiHidden="1" w:unhideWhenUsed="1"/>
-    <w:lsdException w:name="List Number" w:semiHidden="1" w:unhideWhenUsed="1"/>
-    <w:lsdException w:name="List 2" w:semiHidden="1" w:unhideWhenUsed="1"/>
-    <w:lsdException w:name="List 3" w:semiHidden="1" w:unhideWhenUsed="1"/>
-    <w:lsdException w:name="List 4" w:semiHidden="1" w:unhideWhenUsed="1"/>
-    <w:lsdException w:name="List 5" w:semiHidden="1" w:unhideWhenUsed="1"/>
-    <w:lsdException w:name="List Bullet 2" w:semiHidden="1" w:unhideWhenUsed="1"/>
-    <w:lsdException w:name="List Bullet 3" w:semiHidden="1" w:unhideWhenUsed="1"/>
-    <w:lsdException w:name="List Bullet 4" w:semiHidden="1" w:unhideWhenUsed="1"/>
-    <w:lsdException w:name="List Bullet 5" w:semiHidden="1" w:unhideWhenUsed="1"/>
-    <w:lsdException w:name="List Number 2" w:semiHidden="1" w:unhideWhenUsed="1"/>
-    <w:lsdException w:name="List Number 3" w:semiHidden="1" w:unhideWhenUsed="1"/>
-    <w:lsdException w:name="List Number 4" w:semiHidden="1" w:unhideWhenUsed="1"/>
-    <w:lsdException w:name="List Number 5" w:semiHidden="1" w:unhideWhenUsed="1"/>
-    <w:lsdException w:name="Title" w:uiPriority="10" w:qFormat="1"/>
-    <w:lsdException w:name="Closing" w:semiHidden="1" w:unhideWhenUsed="1"/>
-    <w:lsdException w:name="Signature" w:semiHidden="1" w:unhideWhenUsed="1"/>
-    <w:lsdException w:name="Default Paragraph Font" w:semiHidden="1" w:uiPriority="1" w:unhideWhenUsed="1" w:qFormat="1"/>
-    <w:lsdException w:name="Body Text" w:semiHidden="1" w:unhideWhenUsed="1"/>
-    <w:lsdException w:name="Body Text Indent" w:semiHidden="1" w:unhideWhenUsed="1"/>
-    <w:lsdException w:name="List Continue" w:semiHidden="1" w:unhideWhenUsed="1"/>
-    <w:lsdException w:name="List Continue 2" w:semiHidden="1" w:unhideWhenUsed="1"/>
-    <w:lsdException w:name="List Continue 3" w:semiHidden="1" w:unhideWhenUsed="1"/>
-    <w:lsdException w:name="List Continue 4" w:semiHidden="1" w:unhideWhenUsed="1"/>
-    <w:lsdException w:name="List Continue 5" w:semiHidden="1" w:unhideWhenUsed="1"/>
-    <w:lsdException w:name="Message Header" w:semiHidden="1" w:unhideWhenUsed="1"/>
-    <w:lsdException w:name="Subtitle" w:uiPriority="11" w:qFormat="1"/>
-    <w:lsdException w:name="Salutation" w:semiHidden="1" w:unhideWhenUsed="1"/>
-    <w:lsdException w:name="Date" w:semiHidden="1" w:unhideWhenUsed="1"/>
-    <w:lsdException w:name="Body Text First Indent" w:semiHidden="1" w:unhideWhenUsed="1"/>
-    <w:lsdException w:name="Body Text First Indent 2" w:semiHidden="1" w:unhideWhenUsed="1"/>
-    <w:lsdException w:name="Note Heading" w:semiHidden="1" w:unhideWhenUsed="1"/>
-    <w:lsdException w:name="Body Text 2" w:semiHidden="1" w:unhideWhenUsed="1"/>
-    <w:lsdException w:name="Body Text 3" w:semiHidden="1" w:unhideWhenUsed="1"/>
-    <w:lsdException w:name="Body Text Indent 2" w:semiHidden="1" w:unhideWhenUsed="1"/>
-    <w:lsdException w:name="Body Text Indent 3" w:semiHidden="1" w:unhideWhenUsed="1"/>
-    <w:lsdException w:name="Block Text" w:semiHidden="1" w:unhideWhenUsed="1"/>
-    <w:lsdException w:name="Hyperlink" w:unhideWhenUsed="1" w:qFormat="1"/>
-    <w:lsdException w:name="FollowedHyperlink" w:semiHidden="1" w:unhideWhenUsed="1"/>
-    <w:lsdException w:name="Strong" w:uiPriority="22" w:qFormat="1"/>
-    <w:lsdException w:name="Emphasis" w:uiPriority="20" w:qFormat="1"/>
-    <w:lsdException w:name="Document Map" w:semiHidden="1" w:unhideWhenUsed="1"/>
-    <w:lsdException w:name="Plain Text" w:semiHidden="1" w:unhideWhenUsed="1"/>
-    <w:lsdException w:name="E-mail Signature" w:semiHidden="1" w:unhideWhenUsed="1"/>
-    <w:lsdException w:name="HTML Top of Form" w:semiHidden="1" w:unhideWhenUsed="1"/>
-    <w:lsdException w:name="HTML Bottom of Form" w:semiHidden="1" w:unhideWhenUsed="1"/>
-    <w:lsdException w:name="Normal (Web)" w:semiHidden="1" w:unhideWhenUsed="1"/>
-    <w:lsdException w:name="HTML Acronym" w:semiHidden="1" w:unhideWhenUsed="1"/>
-    <w:lsdException w:name="HTML Address" w:semiHidden="1" w:unhideWhenUsed="1"/>
-    <w:lsdException w:name="HTML Cite" w:semiHidden="1" w:unhideWhenUsed="1"/>
-    <w:lsdException w:name="HTML Code" w:semiHidden="1" w:unhideWhenUsed="1"/>
-    <w:lsdException w:name="HTML Definition" w:semiHidden="1" w:unhideWhenUsed="1"/>
-    <w:lsdException w:name="HTML Keyboard" w:semiHidden="1" w:unhideWhenUsed="1"/>
-    <w:lsdException w:name="HTML Preformatted" w:semiHidden="1" w:unhideWhenUsed="1"/>
-    <w:lsdException w:name="HTML Sample" w:semiHidden="1" w:unhideWhenUsed="1"/>
-    <w:lsdException w:name="HTML Typewriter" w:semiHidden="1" w:unhideWhenUsed="1"/>
-    <w:lsdException w:name="HTML Variable" w:semiHidden="1" w:unhideWhenUsed="1"/>
-    <w:lsdException w:name="Normal Table" w:semiHidden="1" w:unhideWhenUsed="1" w:qFormat="1"/>
-    <w:lsdException w:name="annotation subject" w:semiHidden="1" w:unhideWhenUsed="1"/>
-    <w:lsdException w:name="No List" w:semiHidden="1" w:unhideWhenUsed="1"/>
-    <w:lsdException w:name="Outline List 1" w:semiHidden="1" w:unhideWhenUsed="1"/>
-    <w:lsdException w:name="Outline List 2" w:semiHidden="1" w:unhideWhenUsed="1"/>
-    <w:lsdException w:name="Outline List 3" w:semiHidden="1" w:unhideWhenUsed="1"/>
-    <w:lsdException w:name="Table Simple 1" w:semiHidden="1" w:unhideWhenUsed="1"/>
-    <w:lsdException w:name="Table Simple 2" w:semiHidden="1" w:unhideWhenUsed="1"/>
-    <w:lsdException w:name="Table Simple 3" w:semiHidden="1" w:unhideWhenUsed="1"/>
-    <w:lsdException w:name="Table Classic 1" w:semiHidden="1" w:unhideWhenUsed="1"/>
-    <w:lsdException w:name="Table Classic 2" w:semiHidden="1" w:unhideWhenUsed="1"/>
-    <w:lsdException w:name="Table Classic 3" w:semiHidden="1" w:unhideWhenUsed="1"/>
-    <w:lsdException w:name="Table Classic 4" w:semiHidden="1" w:unhideWhenUsed="1"/>
-    <w:lsdException w:name="Table Colorful 1" w:semiHidden="1" w:unhideWhenUsed="1"/>
-    <w:lsdException w:name="Table Colorful 2" w:semiHidden="1" w:unhideWhenUsed="1"/>
-    <w:lsdException w:name="Table Colorful 3" w:semiHidden="1" w:unhideWhenUsed="1"/>
-    <w:lsdException w:name="Table Columns 1" w:semiHidden="1" w:unhideWhenUsed="1"/>
-    <w:lsdException w:name="Table Columns 2" w:semiHidden="1" w:unhideWhenUsed="1"/>
-    <w:lsdException w:name="Table Columns 3" w:semiHidden="1" w:unhideWhenUsed="1"/>
-    <w:lsdException w:name="Table Columns 4" w:semiHidden="1" w:unhideWhenUsed="1"/>
-    <w:lsdException w:name="Table Columns 5" w:semiHidden="1" w:unhideWhenUsed="1"/>
-    <w:lsdException w:name="Table Grid 1" w:semiHidden="1" w:unhideWhenUsed="1"/>
-    <w:lsdException w:name="Table Grid 2" w:semiHidden="1" w:unhideWhenUsed="1"/>
-    <w:lsdException w:name="Table Grid 3" w:semiHidden="1" w:unhideWhenUsed="1"/>
-    <w:lsdException w:name="Table Grid 4" w:semiHidden="1" w:unhideWhenUsed="1"/>
-    <w:lsdException w:name="Table Grid 5" w:semiHidden="1" w:unhideWhenUsed="1"/>
-    <w:lsdException w:name="Table Grid 6" w:semiHidden="1" w:unhideWhenUsed="1"/>
-    <w:lsdException w:name="Table Grid 7" w:semiHidden="1" w:unhideWhenUsed="1"/>
-    <w:lsdException w:name="Table Grid 8" w:semiHidden="1" w:unhideWhenUsed="1"/>
-    <w:lsdException w:name="Table List 1" w:semiHidden="1" w:unhideWhenUsed="1"/>
-    <w:lsdException w:name="Table List 2" w:semiHidden="1" w:unhideWhenUsed="1"/>
-    <w:lsdException w:name="Table List 3" w:semiHidden="1" w:unhideWhenUsed="1"/>
-    <w:lsdException w:name="Table List 4" w:semiHidden="1" w:unhideWhenUsed="1"/>
-    <w:lsdException w:name="Table List 5" w:semiHidden="1" w:unhideWhenUsed="1"/>
-    <w:lsdException w:name="Table List 6" w:semiHidden="1" w:unhideWhenUsed="1"/>
-    <w:lsdException w:name="Table List 7" w:semiHidden="1" w:unhideWhenUsed="1"/>
-    <w:lsdException w:name="Table List 8" w:semiHidden="1" w:unhideWhenUsed="1"/>
-    <w:lsdException w:name="Table 3D effects 1" w:semiHidden="1" w:unhideWhenUsed="1"/>
-    <w:lsdException w:name="Table 3D effects 2" w:semiHidden="1" w:unhideWhenUsed="1"/>
-    <w:lsdException w:name="Table 3D effects 3" w:semiHidden="1" w:unhideWhenUsed="1"/>
-    <w:lsdException w:name="Table Contemporary" w:semiHidden="1" w:unhideWhenUsed="1"/>
-    <w:lsdException w:name="Table Elegant" w:semiHidden="1" w:unhideWhenUsed="1"/>
-    <w:lsdException w:name="Table Professional" w:semiHidden="1" w:unhideWhenUsed="1"/>
-    <w:lsdException w:name="Table Subtle 1" w:semiHidden="1" w:unhideWhenUsed="1"/>
-    <w:lsdException w:name="Table Subtle 2" w:semiHidden="1" w:unhideWhenUsed="1"/>
-    <w:lsdException w:name="Table Web 1" w:semiHidden="1" w:unhideWhenUsed="1"/>
-    <w:lsdException w:name="Table Web 2" w:semiHidden="1" w:unhideWhenUsed="1"/>
-    <w:lsdException w:name="Table Web 3" w:semiHidden="1" w:unhideWhenUsed="1"/>
-    <w:lsdException w:name="Balloon Text" w:semiHidden="1" w:unhideWhenUsed="1"/>
-    <w:lsdException w:name="Table Grid" w:uiPriority="39" w:qFormat="1"/>
-    <w:lsdException w:name="Table Theme" w:semiHidden="1" w:unhideWhenUsed="1"/>
-    <w:lsdException w:name="Placeholder Text" w:semiHidden="1" w:unhideWhenUsed="1"/>
-    <w:lsdException w:name="No Spacing" w:semiHidden="1" w:unhideWhenUsed="1"/>
-    <w:lsdException w:name="Light Shading" w:uiPriority="60"/>
-    <w:lsdException w:name="Light List" w:uiPriority="61"/>
-    <w:lsdException w:name="Light Grid" w:uiPriority="62"/>
-    <w:lsdException w:name="Medium Shading 1" w:uiPriority="63"/>
-    <w:lsdException w:name="Medium Shading 2" w:uiPriority="64"/>
-    <w:lsdException w:name="Medium List 1" w:uiPriority="65"/>
-    <w:lsdException w:name="Medium List 2" w:uiPriority="66"/>
-    <w:lsdException w:name="Medium Grid 1" w:uiPriority="67"/>
-    <w:lsdException w:name="Medium Grid 2" w:uiPriority="68"/>
-    <w:lsdException w:name="Medium Grid 3" w:uiPriority="69"/>
-    <w:lsdException w:name="Dark List" w:uiPriority="70"/>
-    <w:lsdException w:name="Colorful Shading" w:uiPriority="71"/>
-    <w:lsdException w:name="Colorful List" w:uiPriority="72"/>
-    <w:lsdException w:name="Colorful Grid" w:uiPriority="73"/>
-    <w:lsdException w:name="Light Shading Accent 1" w:uiPriority="60"/>
-    <w:lsdException w:name="Light List Accent 1" w:uiPriority="61"/>
-    <w:lsdException w:name="Light Grid Accent 1" w:uiPriority="62"/>
-    <w:lsdException w:name="Medium Shading 1 Accent 1" w:uiPriority="63"/>
-    <w:lsdException w:name="Medium Shading 2 Accent 1" w:uiPriority="64"/>
-    <w:lsdException w:name="Medium List 1 Accent 1" w:uiPriority="65"/>
-    <w:lsdException w:name="Revision" w:semiHidden="1" w:unhideWhenUsed="1"/>
-    <w:lsdException w:name="List Paragraph" w:uiPriority="34" w:qFormat="1"/>
-    <w:lsdException w:name="Quote" w:uiPriority="29" w:qFormat="1"/>
-    <w:lsdException w:name="Intense Quote" w:uiPriority="30" w:qFormat="1"/>
-    <w:lsdException w:name="Medium List 2 Accent 1" w:uiPriority="66"/>
-    <w:lsdException w:name="Medium Grid 1 Accent 1" w:uiPriority="67"/>
-    <w:lsdException w:name="Medium Grid 2 Accent 1" w:uiPriority="68"/>
-    <w:lsdException w:name="Medium Grid 3 Accent 1" w:uiPriority="69"/>
-    <w:lsdException w:name="Dark List Accent 1" w:uiPriority="70"/>
-    <w:lsdException w:name="Colorful Shading Accent 1" w:uiPriority="71"/>
-    <w:lsdException w:name="Colorful List Accent 1" w:uiPriority="72"/>
-    <w:lsdException w:name="Colorful Grid Accent 1" w:uiPriority="73"/>
-    <w:lsdException w:name="Light Shading Accent 2" w:uiPriority="60"/>
-    <w:lsdException w:name="Light List Accent 2" w:uiPriority="61"/>
-    <w:lsdException w:name="Light Grid Accent 2" w:uiPriority="62"/>
-    <w:lsdException w:name="Medium Shading 1 Accent 2" w:uiPriority="63"/>
-    <w:lsdException w:name="Medium Shading 2 Accent 2" w:uiPriority="64"/>
-    <w:lsdException w:name="Medium List 1 Accent 2" w:uiPriority="65"/>
-    <w:lsdException w:name="Medium List 2 Accent 2" w:uiPriority="66"/>
-    <w:lsdException w:name="Medium Grid 1 Accent 2" w:uiPriority="67"/>
-    <w:lsdException w:name="Medium Grid 2 Accent 2" w:uiPriority="68"/>
-    <w:lsdException w:name="Medium Grid 3 Accent 2" w:uiPriority="69"/>
-    <w:lsdException w:name="Dark List Accent 2" w:uiPriority="70"/>
-    <w:lsdException w:name="Colorful Shading Accent 2" w:uiPriority="71"/>
-    <w:lsdException w:name="Colorful List Accent 2" w:uiPriority="72"/>
-    <w:lsdException w:name="Colorful Grid Accent 2" w:uiPriority="73"/>
-    <w:lsdException w:name="Light Shading Accent 3" w:uiPriority="60"/>
-    <w:lsdException w:name="Light List Accent 3" w:uiPriority="61"/>
-    <w:lsdException w:name="Light Grid Accent 3" w:uiPriority="62"/>
-    <w:lsdException w:name="Medium Shading 1 Accent 3" w:uiPriority="63"/>
-    <w:lsdException w:name="Medium Shading 2 Accent 3" w:uiPriority="64"/>
-    <w:lsdException w:name="Medium List 1 Accent 3" w:uiPriority="65"/>
-    <w:lsdException w:name="Medium List 2 Accent 3" w:uiPriority="66"/>
-    <w:lsdException w:name="Medium Grid 1 Accent 3" w:uiPriority="67"/>
-    <w:lsdException w:name="Medium Grid 2 Accent 3" w:uiPriority="68"/>
-    <w:lsdException w:name="Medium Grid 3 Accent 3" w:uiPriority="69"/>
-    <w:lsdException w:name="Dark List Accent 3" w:uiPriority="70"/>
-    <w:lsdException w:name="Colorful Shading Accent 3" w:uiPriority="71"/>
-    <w:lsdException w:name="Colorful List Accent 3" w:uiPriority="72"/>
-    <w:lsdException w:name="Colorful Grid Accent 3" w:uiPriority="73"/>
-    <w:lsdException w:name="Light Shading Accent 4" w:uiPriority="60"/>
-    <w:lsdException w:name="Light List Accent 4" w:uiPriority="61"/>
-    <w:lsdException w:name="Light Grid Accent 4" w:uiPriority="62"/>
-    <w:lsdException w:name="Medium Shading 1 Accent 4" w:uiPriority="63"/>
-    <w:lsdException w:name="Medium Shading 2 Accent 4" w:uiPriority="64"/>
-    <w:lsdException w:name="Medium List 1 Accent 4" w:uiPriority="65"/>
-    <w:lsdException w:name="Medium List 2 Accent 4" w:uiPriority="66"/>
-    <w:lsdException w:name="Medium Grid 1 Accent 4" w:uiPriority="67"/>
-    <w:lsdException w:name="Medium Grid 2 Accent 4" w:uiPriority="68"/>
-    <w:lsdException w:name="Medium Grid 3 Accent 4" w:uiPriority="69"/>
-    <w:lsdException w:name="Dark List Accent 4" w:uiPriority="70"/>
-    <w:lsdException w:name="Colorful Shading Accent 4" w:uiPriority="71"/>
-    <w:lsdException w:name="Colorful List Accent 4" w:uiPriority="72"/>
-    <w:lsdException w:name="Colorful Grid Accent 4" w:uiPriority="73"/>
-    <w:lsdException w:name="Light Shading Accent 5" w:uiPriority="60"/>
-    <w:lsdException w:name="Light List Accent 5" w:uiPriority="61"/>
-    <w:lsdException w:name="Light Grid Accent 5" w:uiPriority="62"/>
-    <w:lsdException w:name="Medium Shading 1 Accent 5" w:uiPriority="63"/>
-    <w:lsdException w:name="Medium Shading 2 Accent 5" w:uiPriority="64"/>
-    <w:lsdException w:name="Medium List 1 Accent 5" w:uiPriority="65"/>
-    <w:lsdException w:name="Medium List 2 Accent 5" w:uiPriority="66"/>
-    <w:lsdException w:name="Medium Grid 1 Accent 5" w:uiPriority="67"/>
-    <w:lsdException w:name="Medium Grid 2 Accent 5" w:uiPriority="68"/>
-    <w:lsdException w:name="Medium Grid 3 Accent 5" w:uiPriority="69"/>
-    <w:lsdException w:name="Dark List Accent 5" w:uiPriority="70"/>
-    <w:lsdException w:name="Colorful Shading Accent 5" w:uiPriority="71"/>
-    <w:lsdException w:name="Colorful List Accent 5" w:uiPriority="72"/>
-    <w:lsdException w:name="Colorful Grid Accent 5" w:uiPriority="73"/>
-    <w:lsdException w:name="Light Shading Accent 6" w:uiPriority="60"/>
-    <w:lsdException w:name="Light List Accent 6" w:uiPriority="61"/>
-    <w:lsdException w:name="Light Grid Accent 6" w:uiPriority="62"/>
-    <w:lsdException w:name="Medium Shading 1 Accent 6" w:uiPriority="63"/>
-    <w:lsdException w:name="Medium Shading 2 Accent 6" w:uiPriority="64"/>
-    <w:lsdException w:name="Medium List 1 Accent 6" w:uiPriority="65"/>
-    <w:lsdException w:name="Medium List 2 Accent 6" w:uiPriority="66"/>
-    <w:lsdException w:name="Medium Grid 1 Accent 6" w:uiPriority="67"/>
-    <w:lsdException w:name="Medium Grid 2 Accent 6" w:uiPriority="68"/>
-    <w:lsdException w:name="Medium Grid 3 Accent 6" w:uiPriority="69"/>
-    <w:lsdException w:name="Dark List Accent 6" w:uiPriority="70"/>
-    <w:lsdException w:name="Colorful Shading Accent 6" w:uiPriority="71"/>
-    <w:lsdException w:name="Colorful List Accent 6" w:uiPriority="72"/>
-    <w:lsdException w:name="Colorful Grid Accent 6" w:uiPriority="73"/>
-    <w:lsdException w:name="Subtle Emphasis" w:uiPriority="19" w:qFormat="1"/>
-    <w:lsdException w:name="Intense Emphasis" w:uiPriority="21" w:qFormat="1"/>
-    <w:lsdException w:name="Subtle Reference" w:uiPriority="31" w:qFormat="1"/>
-    <w:lsdException w:name="Intense Reference" w:uiPriority="32" w:qFormat="1"/>
-    <w:lsdException w:name="Book Title" w:uiPriority="33" w:qFormat="1"/>
-    <w:lsdException w:name="Bibliography" w:semiHidden="1" w:uiPriority="37" w:unhideWhenUsed="1"/>
-    <w:lsdException w:name="TOC Heading" w:semiHidden="1" w:uiPriority="39" w:unhideWhenUsed="1" w:qFormat="1"/>
-    <w:lsdException w:name="Plain Table 1" w:uiPriority="41"/>
-    <w:lsdException w:name="Plain Table 2" w:uiPriority="42"/>
-    <w:lsdException w:name="Plain Table 3" w:uiPriority="43"/>
-    <w:lsdException w:name="Plain Table 4" w:uiPriority="44"/>
-    <w:lsdException w:name="Plain Table 5" w:uiPriority="45"/>
-    <w:lsdException w:name="Grid Table Light" w:uiPriority="40"/>
-    <w:lsdException w:name="Grid Table 1 Light" w:uiPriority="46"/>
-    <w:lsdException w:name="Grid Table 2" w:uiPriority="47"/>
-    <w:lsdException w:name="Grid Table 3" w:uiPriority="48"/>
-    <w:lsdException w:name="Grid Table 4" w:uiPriority="49"/>
-    <w:lsdException w:name="Grid Table 5 Dark" w:uiPriority="50"/>
-    <w:lsdException w:name="Grid Table 6 Colorful" w:uiPriority="51"/>
-    <w:lsdException w:name="Grid Table 7 Colorful" w:uiPriority="52"/>
-    <w:lsdException w:name="Grid Table 1 Light Accent 1" w:uiPriority="46"/>
-    <w:lsdException w:name="Grid Table 2 Accent 1" w:uiPriority="47"/>
-    <w:lsdException w:name="Grid Table 3 Accent 1" w:uiPriority="48"/>
-    <w:lsdException w:name="Grid Table 4 Accent 1" w:uiPriority="49"/>
-    <w:lsdException w:name="Grid Table 5 Dark Accent 1" w:uiPriority="50"/>
-    <w:lsdException w:name="Grid Table 6 Colorful Accent 1" w:uiPriority="51"/>
-    <w:lsdException w:name="Grid Table 7 Colorful Accent 1" w:uiPriority="52"/>
-    <w:lsdException w:name="Grid Table 1 Light Accent 2" w:uiPriority="46"/>
-    <w:lsdException w:name="Grid Table 2 Accent 2" w:uiPriority="47"/>
-    <w:lsdException w:name="Grid Table 3 Accent 2" w:uiPriority="48"/>
-    <w:lsdException w:name="Grid Table 4 Accent 2" w:uiPriority="49"/>
-    <w:lsdException w:name="Grid Table 5 Dark Accent 2" w:uiPriority="50"/>
-    <w:lsdException w:name="Grid Table 6 Colorful Accent 2" w:uiPriority="51"/>
-    <w:lsdException w:name="Grid Table 7 Colorful Accent 2" w:uiPriority="52"/>
-    <w:lsdException w:name="Grid Table 1 Light Accent 3" w:uiPriority="46"/>
-    <w:lsdException w:name="Grid Table 2 Accent 3" w:uiPriority="47"/>
-    <w:lsdException w:name="Grid Table 3 Accent 3" w:uiPriority="48"/>
-    <w:lsdException w:name="Grid Table 4 Accent 3" w:uiPriority="49"/>
-    <w:lsdException w:name="Grid Table 5 Dark Accent 3" w:uiPriority="50"/>
-    <w:lsdException w:name="Grid Table 6 Colorful Accent 3" w:uiPriority="51"/>
-    <w:lsdException w:name="Grid Table 7 Colorful Accent 3" w:uiPriority="52"/>
-    <w:lsdException w:name="Grid Table 1 Light Accent 4" w:uiPriority="46"/>
-    <w:lsdException w:name="Grid Table 2 Accent 4" w:uiPriority="47"/>
-    <w:lsdException w:name="Grid Table 3 Accent 4" w:uiPriority="48"/>
-    <w:lsdException w:name="Grid Table 4 Accent 4" w:uiPriority="49"/>
-    <w:lsdException w:name="Grid Table 5 Dark Accent 4" w:uiPriority="50"/>
-    <w:lsdException w:name="Grid Table 6 Colorful Accent 4" w:uiPriority="51"/>
-    <w:lsdException w:name="Grid Table 7 Colorful Accent 4" w:uiPriority="52"/>
-    <w:lsdException w:name="Grid Table 1 Light Accent 5" w:uiPriority="46"/>
-    <w:lsdException w:name="Grid Table 2 Accent 5" w:uiPriority="47"/>
-    <w:lsdException w:name="Grid Table 3 Accent 5" w:uiPriority="48"/>
-    <w:lsdException w:name="Grid Table 4 Accent 5" w:uiPriority="49"/>
-    <w:lsdException w:name="Grid Table 5 Dark Accent 5" w:uiPriority="50"/>
-    <w:lsdException w:name="Grid Table 6 Colorful Accent 5" w:uiPriority="51"/>
-    <w:lsdException w:name="Grid Table 7 Colorful Accent 5" w:uiPriority="52"/>
-    <w:lsdException w:name="Grid Table 1 Light Accent 6" w:uiPriority="46"/>
-    <w:lsdException w:name="Grid Table 2 Accent 6" w:uiPriority="47"/>
-    <w:lsdException w:name="Grid Table 3 Accent 6" w:uiPriority="48"/>
-    <w:lsdException w:name="Grid Table 4 Accent 6" w:uiPriority="49"/>
-    <w:lsdException w:name="Grid Table 5 Dark Accent 6" w:uiPriority="50"/>
-    <w:lsdException w:name="Grid Table 6 Colorful Accent 6" w:uiPriority="51"/>
-    <w:lsdException w:name="Grid Table 7 Colorful Accent 6" w:uiPriority="52"/>
-    <w:lsdException w:name="List Table 1 Light" w:uiPriority="46"/>
-    <w:lsdException w:name="List Table 2" w:uiPriority="47"/>
-    <w:lsdException w:name="List Table 3" w:uiPriority="48"/>
-    <w:lsdException w:name="List Table 4" w:uiPriority="49"/>
-    <w:lsdException w:name="List Table 5 Dark" w:uiPriority="50"/>
-    <w:lsdException w:name="List Table 6 Colorful" w:uiPriority="51"/>
-    <w:lsdException w:name="List Table 7 Colorful" w:uiPriority="52"/>
-    <w:lsdException w:name="List Table 1 Light Accent 1" w:uiPriority="46"/>
-    <w:lsdException w:name="List Table 2 Accent 1" w:uiPriority="47"/>
-    <w:lsdException w:name="List Table 3 Accent 1" w:uiPriority="48"/>
-    <w:lsdException w:name="List Table 4 Accent 1" w:uiPriority="49"/>
-    <w:lsdException w:name="List Table 5 Dark Accent 1" w:uiPriority="50"/>
-    <w:lsdException w:name="List Table 6 Colorful Accent 1" w:uiPriority="51"/>
-    <w:lsdException w:name="List Table 7 Colorful Accent 1" w:uiPriority="52"/>
-    <w:lsdException w:name="List Table 1 Light Accent 2" w:uiPriority="46"/>
-    <w:lsdException w:name="List Table 2 Accent 2" w:uiPriority="47"/>
-    <w:lsdException w:name="List Table 3 Accent 2" w:uiPriority="48"/>
-    <w:lsdException w:name="List Table 4 Accent 2" w:uiPriority="49"/>
-    <w:lsdException w:name="List Table 5 Dark Accent 2" w:uiPriority="50"/>
-    <w:lsdException w:name="List Table 6 Colorful Accent 2" w:uiPriority="51"/>
-    <w:lsdException w:name="List Table 7 Colorful Accent 2" w:uiPriority="52"/>
-    <w:lsdException w:name="List Table 1 Light Accent 3" w:uiPriority="46"/>
-    <w:lsdException w:name="List Table 2 Accent 3" w:uiPriority="47"/>
-    <w:lsdException w:name="List Table 3 Accent 3" w:uiPriority="48"/>
-    <w:lsdException w:name="List Table 4 Accent 3" w:uiPriority="49"/>
-    <w:lsdException w:name="List Table 5 Dark Accent 3" w:uiPriority="50"/>
-    <w:lsdException w:name="List Table 6 Colorful Accent 3" w:uiPriority="51"/>
-    <w:lsdException w:name="List Table 7 Colorful Accent 3" w:uiPriority="52"/>
-    <w:lsdException w:name="List Table 1 Light Accent 4" w:uiPriority="46"/>
-    <w:lsdException w:name="List Table 2 Accent 4" w:uiPriority="47"/>
-    <w:lsdException w:name="List Table 3 Accent 4" w:uiPriority="48"/>
-    <w:lsdException w:name="List Table 4 Accent 4" w:uiPriority="49"/>
-    <w:lsdException w:name="List Table 5 Dark Accent 4" w:uiPriority="50"/>
-    <w:lsdException w:name="List Table 6 Colorful Accent 4" w:uiPriority="51"/>
-    <w:lsdException w:name="List Table 7 Colorful Accent 4" w:uiPriority="52"/>
-    <w:lsdException w:name="List Table 1 Light Accent 5" w:uiPriority="46"/>
-    <w:lsdException w:name="List Table 2 Accent 5" w:uiPriority="47"/>
-    <w:lsdException w:name="List Table 3 Accent 5" w:uiPriority="48"/>
-    <w:lsdException w:name="List Table 4 Accent 5" w:uiPriority="49"/>
-    <w:lsdException w:name="List Table 5 Dark Accent 5" w:uiPriority="50"/>
-    <w:lsdException w:name="List Table 6 Colorful Accent 5" w:uiPriority="51"/>
-    <w:lsdException w:name="List Table 7 Colorful Accent 5" w:uiPriority="52"/>
-    <w:lsdException w:name="List Table 1 Light Accent 6" w:uiPriority="46"/>
-    <w:lsdException w:name="List Table 2 Accent 6" w:uiPriority="47"/>
-    <w:lsdException w:name="List Table 3 Accent 6" w:uiPriority="48"/>
-    <w:lsdException w:name="List Table 4 Accent 6" w:uiPriority="49"/>
-    <w:lsdException w:name="List Table 5 Dark Accent 6" w:uiPriority="50"/>
-    <w:lsdException w:name="List Table 6 Colorful Accent 6" w:uiPriority="51"/>
-    <w:lsdException w:name="List Table 7 Colorful Accent 6" w:uiPriority="52"/>
-    <w:lsdException w:name="Mention" w:semiHidden="1" w:unhideWhenUsed="1"/>
-    <w:lsdException w:name="Smart Hyperlink" w:semiHidden="1" w:unhideWhenUsed="1"/>
-    <w:lsdException w:name="Hashtag" w:semiHidden="1" w:unhideWhenUsed="1"/>
-    <w:lsdException w:name="Unresolved Mention" w:semiHidden="1" w:unhideWhenUsed="1"/>
-    <w:lsdException w:name="Smart Link" w:semiHidden="1" w:unhideWhenUsed="1"/>
+  <w:latentStyles w:count="260" w:defQFormat="0" w:defUnhideWhenUsed="1" w:defSemiHidden="1" w:defUIPriority="99" w:defLockedState="0">
+    <w:lsdException w:qFormat="1" w:unhideWhenUsed="0" w:uiPriority="0" w:semiHidden="0" w:name="Normal"/>
+    <w:lsdException w:qFormat="1" w:unhideWhenUsed="0" w:uiPriority="9" w:semiHidden="0" w:name="heading 1"/>
+    <w:lsdException w:qFormat="1" w:uiPriority="9" w:name="heading 2"/>
+    <w:lsdException w:qFormat="1" w:uiPriority="9" w:name="heading 3"/>
+    <w:lsdException w:qFormat="1" w:uiPriority="9" w:name="heading 4"/>
+    <w:lsdException w:qFormat="1" w:uiPriority="9" w:name="heading 5"/>
+    <w:lsdException w:qFormat="1" w:uiPriority="9" w:name="heading 6"/>
+    <w:lsdException w:qFormat="1" w:uiPriority="9" w:name="heading 7"/>
+    <w:lsdException w:qFormat="1" w:uiPriority="9" w:name="heading 8"/>
+    <w:lsdException w:qFormat="1" w:uiPriority="9" w:name="heading 9"/>
+    <w:lsdException w:uiPriority="99" w:name="index 1"/>
+    <w:lsdException w:uiPriority="99" w:name="index 2"/>
+    <w:lsdException w:uiPriority="99" w:name="index 3"/>
+    <w:lsdException w:uiPriority="99" w:name="index 4"/>
+    <w:lsdException w:uiPriority="99" w:name="index 5"/>
+    <w:lsdException w:uiPriority="99" w:name="index 6"/>
+    <w:lsdException w:uiPriority="99" w:name="index 7"/>
+    <w:lsdException w:uiPriority="99" w:name="index 8"/>
+    <w:lsdException w:uiPriority="99" w:name="index 9"/>
+    <w:lsdException w:uiPriority="39" w:name="toc 1"/>
+    <w:lsdException w:uiPriority="39" w:name="toc 2"/>
+    <w:lsdException w:uiPriority="39" w:name="toc 3"/>
+    <w:lsdException w:uiPriority="39" w:name="toc 4"/>
+    <w:lsdException w:uiPriority="39" w:name="toc 5"/>
+    <w:lsdException w:uiPriority="39" w:name="toc 6"/>
+    <w:lsdException w:uiPriority="39" w:name="toc 7"/>
+    <w:lsdException w:uiPriority="39" w:name="toc 8"/>
+    <w:lsdException w:uiPriority="39" w:name="toc 9"/>
+    <w:lsdException w:uiPriority="99" w:name="Normal Indent"/>
+    <w:lsdException w:uiPriority="99" w:name="footnote text"/>
+    <w:lsdException w:uiPriority="99" w:name="annotation text"/>
+    <w:lsdException w:qFormat="1" w:uiPriority="99" w:semiHidden="0" w:name="header"/>
+    <w:lsdException w:qFormat="1" w:uiPriority="99" w:semiHidden="0" w:name="footer"/>
+    <w:lsdException w:uiPriority="99" w:name="index heading"/>
+    <w:lsdException w:qFormat="1" w:uiPriority="35" w:name="caption"/>
+    <w:lsdException w:uiPriority="99" w:name="table of figures"/>
+    <w:lsdException w:uiPriority="99" w:name="envelope address"/>
+    <w:lsdException w:uiPriority="99" w:name="envelope return"/>
+    <w:lsdException w:uiPriority="99" w:name="footnote reference"/>
+    <w:lsdException w:uiPriority="99" w:name="annotation reference"/>
+    <w:lsdException w:uiPriority="99" w:name="line number"/>
+    <w:lsdException w:uiPriority="99" w:name="page number"/>
+    <w:lsdException w:uiPriority="99" w:name="endnote reference"/>
+    <w:lsdException w:uiPriority="99" w:name="endnote text"/>
+    <w:lsdException w:uiPriority="99" w:name="table of authorities"/>
+    <w:lsdException w:uiPriority="99" w:name="macro"/>
+    <w:lsdException w:uiPriority="99" w:name="toa heading"/>
+    <w:lsdException w:uiPriority="99" w:name="List"/>
+    <w:lsdException w:uiPriority="99" w:name="List Bullet"/>
+    <w:lsdException w:uiPriority="99" w:name="List Number"/>
+    <w:lsdException w:uiPriority="99" w:name="List 2"/>
+    <w:lsdException w:uiPriority="99" w:name="List 3"/>
+    <w:lsdException w:uiPriority="99" w:name="List 4"/>
+    <w:lsdException w:uiPriority="99" w:name="List 5"/>
+    <w:lsdException w:uiPriority="99" w:name="List Bullet 2"/>
+    <w:lsdException w:uiPriority="99" w:name="List Bullet 3"/>
+    <w:lsdException w:uiPriority="99" w:name="List Bullet 4"/>
+    <w:lsdException w:uiPriority="99" w:name="List Bullet 5"/>
+    <w:lsdException w:uiPriority="99" w:name="List Number 2"/>
+    <w:lsdException w:uiPriority="99" w:name="List Number 3"/>
+    <w:lsdException w:uiPriority="99" w:name="List Number 4"/>
+    <w:lsdException w:uiPriority="99" w:name="List Number 5"/>
+    <w:lsdException w:qFormat="1" w:unhideWhenUsed="0" w:uiPriority="10" w:semiHidden="0" w:name="Title"/>
+    <w:lsdException w:uiPriority="99" w:name="Closing"/>
+    <w:lsdException w:uiPriority="99" w:name="Signature"/>
+    <w:lsdException w:uiPriority="1" w:name="Default Paragraph Font"/>
+    <w:lsdException w:uiPriority="99" w:name="Body Text"/>
+    <w:lsdException w:uiPriority="99" w:name="Body Text Indent"/>
+    <w:lsdException w:uiPriority="99" w:name="List Continue"/>
+    <w:lsdException w:uiPriority="99" w:name="List Continue 2"/>
+    <w:lsdException w:uiPriority="99" w:name="List Continue 3"/>
+    <w:lsdException w:uiPriority="99" w:name="List Continue 4"/>
+    <w:lsdException w:uiPriority="99" w:name="List Continue 5"/>
+    <w:lsdException w:uiPriority="99" w:name="Message Header"/>
+    <w:lsdException w:qFormat="1" w:unhideWhenUsed="0" w:uiPriority="11" w:semiHidden="0" w:name="Subtitle"/>
+    <w:lsdException w:uiPriority="99" w:name="Salutation"/>
+    <w:lsdException w:uiPriority="99" w:name="Date"/>
+    <w:lsdException w:uiPriority="99" w:name="Body Text First Indent"/>
+    <w:lsdException w:uiPriority="99" w:name="Body Text First Indent 2"/>
+    <w:lsdException w:uiPriority="99" w:name="Note Heading"/>
+    <w:lsdException w:uiPriority="99" w:name="Body Text 2"/>
+    <w:lsdException w:uiPriority="99" w:name="Body Text 3"/>
+    <w:lsdException w:uiPriority="99" w:name="Body Text Indent 2"/>
+    <w:lsdException w:uiPriority="99" w:name="Body Text Indent 3"/>
+    <w:lsdException w:uiPriority="99" w:name="Block Text"/>
+    <w:lsdException w:qFormat="1" w:uiPriority="99" w:semiHidden="0" w:name="Hyperlink"/>
+    <w:lsdException w:uiPriority="99" w:name="FollowedHyperlink"/>
+    <w:lsdException w:qFormat="1" w:unhideWhenUsed="0" w:uiPriority="22" w:semiHidden="0" w:name="Strong"/>
+    <w:lsdException w:qFormat="1" w:unhideWhenUsed="0" w:uiPriority="20" w:semiHidden="0" w:name="Emphasis"/>
+    <w:lsdException w:uiPriority="99" w:name="Document Map"/>
+    <w:lsdException w:uiPriority="99" w:name="Plain Text"/>
+    <w:lsdException w:uiPriority="99" w:name="E-mail Signature"/>
+    <w:lsdException w:uiPriority="99" w:name="Normal (Web)"/>
+    <w:lsdException w:uiPriority="99" w:name="HTML Acronym"/>
+    <w:lsdException w:uiPriority="99" w:name="HTML Address"/>
+    <w:lsdException w:uiPriority="99" w:name="HTML Cite"/>
+    <w:lsdException w:uiPriority="99" w:name="HTML Code"/>
+    <w:lsdException w:uiPriority="99" w:name="HTML Definition"/>
+    <w:lsdException w:uiPriority="99" w:name="HTML Keyboard"/>
+    <w:lsdException w:uiPriority="99" w:name="HTML Preformatted"/>
+    <w:lsdException w:uiPriority="99" w:name="HTML Sample"/>
+    <w:lsdException w:uiPriority="99" w:name="HTML Typewriter"/>
+    <w:lsdException w:uiPriority="99" w:name="HTML Variable"/>
+    <w:lsdException w:qFormat="1" w:uiPriority="99" w:name="Normal Table"/>
+    <w:lsdException w:uiPriority="99" w:name="annotation subject"/>
+    <w:lsdException w:uiPriority="99" w:name="Table Simple 1"/>
+    <w:lsdException w:uiPriority="99" w:name="Table Simple 2"/>
+    <w:lsdException w:uiPriority="99" w:name="Table Simple 3"/>
+    <w:lsdException w:uiPriority="99" w:name="Table Classic 1"/>
+    <w:lsdException w:uiPriority="99" w:name="Table Classic 2"/>
+    <w:lsdException w:uiPriority="99" w:name="Table Classic 3"/>
+    <w:lsdException w:uiPriority="99" w:name="Table Classic 4"/>
+    <w:lsdException w:uiPriority="99" w:name="Table Colorful 1"/>
+    <w:lsdException w:uiPriority="99" w:name="Table Colorful 2"/>
+    <w:lsdException w:uiPriority="99" w:name="Table Colorful 3"/>
+    <w:lsdException w:uiPriority="99" w:name="Table Columns 1"/>
+    <w:lsdException w:uiPriority="99" w:name="Table Columns 2"/>
+    <w:lsdException w:uiPriority="99" w:name="Table Columns 3"/>
+    <w:lsdException w:uiPriority="99" w:name="Table Columns 4"/>
+    <w:lsdException w:uiPriority="99" w:name="Table Columns 5"/>
+    <w:lsdException w:uiPriority="99" w:name="Table Grid 1"/>
+    <w:lsdException w:uiPriority="99" w:name="Table Grid 2"/>
+    <w:lsdException w:uiPriority="99" w:name="Table Grid 3"/>
+    <w:lsdException w:uiPriority="99" w:name="Table Grid 4"/>
+    <w:lsdException w:uiPriority="99" w:name="Table Grid 5"/>
+    <w:lsdException w:uiPriority="99" w:name="Table Grid 6"/>
+    <w:lsdException w:uiPriority="99" w:name="Table Grid 7"/>
+    <w:lsdException w:uiPriority="99" w:name="Table Grid 8"/>
+    <w:lsdException w:uiPriority="99" w:name="Table List 1"/>
+    <w:lsdException w:uiPriority="99" w:name="Table List 2"/>
+    <w:lsdException w:uiPriority="99" w:name="Table List 3"/>
+    <w:lsdException w:uiPriority="99" w:name="Table List 4"/>
+    <w:lsdException w:uiPriority="99" w:name="Table List 5"/>
+    <w:lsdException w:uiPriority="99" w:name="Table List 6"/>
+    <w:lsdException w:uiPriority="99" w:name="Table List 7"/>
+    <w:lsdException w:uiPriority="99" w:name="Table List 8"/>
+    <w:lsdException w:uiPriority="99" w:name="Table 3D effects 1"/>
+    <w:lsdException w:uiPriority="99" w:name="Table 3D effects 2"/>
+    <w:lsdException w:uiPriority="99" w:name="Table 3D effects 3"/>
+    <w:lsdException w:uiPriority="99" w:name="Table Contemporary"/>
+    <w:lsdException w:uiPriority="99" w:name="Table Elegant"/>
+    <w:lsdException w:uiPriority="99" w:name="Table Professional"/>
+    <w:lsdException w:uiPriority="99" w:name="Table Subtle 1"/>
+    <w:lsdException w:uiPriority="99" w:name="Table Subtle 2"/>
+    <w:lsdException w:uiPriority="99" w:name="Table Web 1"/>
+    <w:lsdException w:uiPriority="99" w:name="Table Web 2"/>
+    <w:lsdException w:uiPriority="99" w:name="Table Web 3"/>
+    <w:lsdException w:uiPriority="99" w:name="Balloon Text"/>
+    <w:lsdException w:qFormat="1" w:unhideWhenUsed="0" w:uiPriority="39" w:semiHidden="0" w:name="Table Grid"/>
+    <w:lsdException w:uiPriority="99" w:name="Table Theme"/>
+    <w:lsdException w:unhideWhenUsed="0" w:uiPriority="60" w:semiHidden="0" w:name="Light Shading"/>
+    <w:lsdException w:unhideWhenUsed="0" w:uiPriority="61" w:semiHidden="0" w:name="Light List"/>
+    <w:lsdException w:unhideWhenUsed="0" w:uiPriority="62" w:semiHidden="0" w:name="Light Grid"/>
+    <w:lsdException w:unhideWhenUsed="0" w:uiPriority="63" w:semiHidden="0" w:name="Medium Shading 1"/>
+    <w:lsdException w:unhideWhenUsed="0" w:uiPriority="64" w:semiHidden="0" w:name="Medium Shading 2"/>
+    <w:lsdException w:unhideWhenUsed="0" w:uiPriority="65" w:semiHidden="0" w:name="Medium List 1"/>
+    <w:lsdException w:unhideWhenUsed="0" w:uiPriority="66" w:semiHidden="0" w:name="Medium List 2"/>
+    <w:lsdException w:unhideWhenUsed="0" w:uiPriority="67" w:semiHidden="0" w:name="Medium Grid 1"/>
+    <w:lsdException w:unhideWhenUsed="0" w:uiPriority="68" w:semiHidden="0" w:name="Medium Grid 2"/>
+    <w:lsdException w:unhideWhenUsed="0" w:uiPriority="69" w:semiHidden="0" w:name="Medium Grid 3"/>
+    <w:lsdException w:unhideWhenUsed="0" w:uiPriority="70" w:semiHidden="0" w:name="Dark List"/>
+    <w:lsdException w:unhideWhenUsed="0" w:uiPriority="71" w:semiHidden="0" w:name="Colorful Shading"/>
+    <w:lsdException w:unhideWhenUsed="0" w:uiPriority="72" w:semiHidden="0" w:name="Colorful List"/>
+    <w:lsdException w:unhideWhenUsed="0" w:uiPriority="73" w:semiHidden="0" w:name="Colorful Grid"/>
+    <w:lsdException w:unhideWhenUsed="0" w:uiPriority="60" w:semiHidden="0" w:name="Light Shading Accent 1"/>
+    <w:lsdException w:unhideWhenUsed="0" w:uiPriority="61" w:semiHidden="0" w:name="Light List Accent 1"/>
+    <w:lsdException w:unhideWhenUsed="0" w:uiPriority="62" w:semiHidden="0" w:name="Light Grid Accent 1"/>
+    <w:lsdException w:unhideWhenUsed="0" w:uiPriority="63" w:semiHidden="0" w:name="Medium Shading 1 Accent 1"/>
+    <w:lsdException w:unhideWhenUsed="0" w:uiPriority="64" w:semiHidden="0" w:name="Medium Shading 2 Accent 1"/>
+    <w:lsdException w:unhideWhenUsed="0" w:uiPriority="65" w:semiHidden="0" w:name="Medium List 1 Accent 1"/>
+    <w:lsdException w:qFormat="1" w:unhideWhenUsed="0" w:uiPriority="34" w:semiHidden="0" w:name="List Paragraph"/>
+    <w:lsdException w:qFormat="1" w:unhideWhenUsed="0" w:uiPriority="29" w:semiHidden="0" w:name="Quote"/>
+    <w:lsdException w:qFormat="1" w:unhideWhenUsed="0" w:uiPriority="30" w:semiHidden="0" w:name="Intense Quote"/>
+    <w:lsdException w:unhideWhenUsed="0" w:uiPriority="66" w:semiHidden="0" w:name="Medium List 2 Accent 1"/>
+    <w:lsdException w:unhideWhenUsed="0" w:uiPriority="67" w:semiHidden="0" w:name="Medium Grid 1 Accent 1"/>
+    <w:lsdException w:unhideWhenUsed="0" w:uiPriority="68" w:semiHidden="0" w:name="Medium Grid 2 Accent 1"/>
+    <w:lsdException w:unhideWhenUsed="0" w:uiPriority="69" w:semiHidden="0" w:name="Medium Grid 3 Accent 1"/>
+    <w:lsdException w:unhideWhenUsed="0" w:uiPriority="70" w:semiHidden="0" w:name="Dark List Accent 1"/>
+    <w:lsdException w:unhideWhenUsed="0" w:uiPriority="71" w:semiHidden="0" w:name="Colorful Shading Accent 1"/>
+    <w:lsdException w:unhideWhenUsed="0" w:uiPriority="72" w:semiHidden="0" w:name="Colorful List Accent 1"/>
+    <w:lsdException w:unhideWhenUsed="0" w:uiPriority="73" w:semiHidden="0" w:name="Colorful Grid Accent 1"/>
+    <w:lsdException w:unhideWhenUsed="0" w:uiPriority="60" w:semiHidden="0" w:name="Light Shading Accent 2"/>
+    <w:lsdException w:unhideWhenUsed="0" w:uiPriority="61" w:semiHidden="0" w:name="Light List Accent 2"/>
+    <w:lsdException w:unhideWhenUsed="0" w:uiPriority="62" w:semiHidden="0" w:name="Light Grid Accent 2"/>
+    <w:lsdException w:unhideWhenUsed="0" w:uiPriority="63" w:semiHidden="0" w:name="Medium Shading 1 Accent 2"/>
+    <w:lsdException w:unhideWhenUsed="0" w:uiPriority="64" w:semiHidden="0" w:name="Medium Shading 2 Accent 2"/>
+    <w:lsdException w:unhideWhenUsed="0" w:uiPriority="65" w:semiHidden="0" w:name="Medium List 1 Accent 2"/>
+    <w:lsdException w:unhideWhenUsed="0" w:uiPriority="66" w:semiHidden="0" w:name="Medium List 2 Accent 2"/>
+    <w:lsdException w:unhideWhenUsed="0" w:uiPriority="67" w:semiHidden="0" w:name="Medium Grid 1 Accent 2"/>
+    <w:lsdException w:unhideWhenUsed="0" w:uiPriority="68" w:semiHidden="0" w:name="Medium Grid 2 Accent 2"/>
+    <w:lsdException w:unhideWhenUsed="0" w:uiPriority="69" w:semiHidden="0" w:name="Medium Grid 3 Accent 2"/>
+    <w:lsdException w:unhideWhenUsed="0" w:uiPriority="70" w:semiHidden="0" w:name="Dark List Accent 2"/>
+    <w:lsdException w:unhideWhenUsed="0" w:uiPriority="71" w:semiHidden="0" w:name="Colorful Shading Accent 2"/>
+    <w:lsdException w:unhideWhenUsed="0" w:uiPriority="72" w:semiHidden="0" w:name="Colorful List Accent 2"/>
+    <w:lsdException w:unhideWhenUsed="0" w:uiPriority="73" w:semiHidden="0" w:name="Colorful Grid Accent 2"/>
+    <w:lsdException w:unhideWhenUsed="0" w:uiPriority="60" w:semiHidden="0" w:name="Light Shading Accent 3"/>
+    <w:lsdException w:unhideWhenUsed="0" w:uiPriority="61" w:semiHidden="0" w:name="Light List Accent 3"/>
+    <w:lsdException w:unhideWhenUsed="0" w:uiPriority="62" w:semiHidden="0" w:name="Light Grid Accent 3"/>
+    <w:lsdException w:unhideWhenUsed="0" w:uiPriority="63" w:semiHidden="0" w:name="Medium Shading 1 Accent 3"/>
+    <w:lsdException w:unhideWhenUsed="0" w:uiPriority="64" w:semiHidden="0" w:name="Medium Shading 2 Accent 3"/>
+    <w:lsdException w:unhideWhenUsed="0" w:uiPriority="65" w:semiHidden="0" w:name="Medium List 1 Accent 3"/>
+    <w:lsdException w:unhideWhenUsed="0" w:uiPriority="66" w:semiHidden="0" w:name="Medium List 2 Accent 3"/>
+    <w:lsdException w:unhideWhenUsed="0" w:uiPriority="67" w:semiHidden="0" w:name="Medium Grid 1 Accent 3"/>
+    <w:lsdException w:unhideWhenUsed="0" w:uiPriority="68" w:semiHidden="0" w:name="Medium Grid 2 Accent 3"/>
+    <w:lsdException w:unhideWhenUsed="0" w:uiPriority="69" w:semiHidden="0" w:name="Medium Grid 3 Accent 3"/>
+    <w:lsdException w:unhideWhenUsed="0" w:uiPriority="70" w:semiHidden="0" w:name="Dark List Accent 3"/>
+    <w:lsdException w:unhideWhenUsed="0" w:uiPriority="71" w:semiHidden="0" w:name="Colorful Shading Accent 3"/>
+    <w:lsdException w:unhideWhenUsed="0" w:uiPriority="72" w:semiHidden="0" w:name="Colorful List Accent 3"/>
+    <w:lsdException w:unhideWhenUsed="0" w:uiPriority="73" w:semiHidden="0" w:name="Colorful Grid Accent 3"/>
+    <w:lsdException w:unhideWhenUsed="0" w:uiPriority="60" w:semiHidden="0" w:name="Light Shading Accent 4"/>
+    <w:lsdException w:unhideWhenUsed="0" w:uiPriority="61" w:semiHidden="0" w:name="Light List Accent 4"/>
+    <w:lsdException w:unhideWhenUsed="0" w:uiPriority="62" w:semiHidden="0" w:name="Light Grid Accent 4"/>
+    <w:lsdException w:unhideWhenUsed="0" w:uiPriority="63" w:semiHidden="0" w:name="Medium Shading 1 Accent 4"/>
+    <w:lsdException w:unhideWhenUsed="0" w:uiPriority="64" w:semiHidden="0" w:name="Medium Shading 2 Accent 4"/>
+    <w:lsdException w:unhideWhenUsed="0" w:uiPriority="65" w:semiHidden="0" w:name="Medium List 1 Accent 4"/>
+    <w:lsdException w:unhideWhenUsed="0" w:uiPriority="66" w:semiHidden="0" w:name="Medium List 2 Accent 4"/>
+    <w:lsdException w:unhideWhenUsed="0" w:uiPriority="67" w:semiHidden="0" w:name="Medium Grid 1 Accent 4"/>
+    <w:lsdException w:unhideWhenUsed="0" w:uiPriority="68" w:semiHidden="0" w:name="Medium Grid 2 Accent 4"/>
+    <w:lsdException w:unhideWhenUsed="0" w:uiPriority="69" w:semiHidden="0" w:name="Medium Grid 3 Accent 4"/>
+    <w:lsdException w:unhideWhenUsed="0" w:uiPriority="70" w:semiHidden="0" w:name="Dark List Accent 4"/>
+    <w:lsdException w:unhideWhenUsed="0" w:uiPriority="71" w:semiHidden="0" w:name="Colorful Shading Accent 4"/>
+    <w:lsdException w:unhideWhenUsed="0" w:uiPriority="72" w:semiHidden="0" w:name="Colorful List Accent 4"/>
+    <w:lsdException w:unhideWhenUsed="0" w:uiPriority="73" w:semiHidden="0" w:name="Colorful Grid Accent 4"/>
+    <w:lsdException w:unhideWhenUsed="0" w:uiPriority="60" w:semiHidden="0" w:name="Light Shading Accent 5"/>
+    <w:lsdException w:unhideWhenUsed="0" w:uiPriority="61" w:semiHidden="0" w:name="Light List Accent 5"/>
+    <w:lsdException w:unhideWhenUsed="0" w:uiPriority="62" w:semiHidden="0" w:name="Light Grid Accent 5"/>
+    <w:lsdException w:unhideWhenUsed="0" w:uiPriority="63" w:semiHidden="0" w:name="Medium Shading 1 Accent 5"/>
+    <w:lsdException w:unhideWhenUsed="0" w:uiPriority="64" w:semiHidden="0" w:name="Medium Shading 2 Accent 5"/>
+    <w:lsdException w:unhideWhenUsed="0" w:uiPriority="65" w:semiHidden="0" w:name="Medium List 1 Accent 5"/>
+    <w:lsdException w:unhideWhenUsed="0" w:uiPriority="66" w:semiHidden="0" w:name="Medium List 2 Accent 5"/>
+    <w:lsdException w:unhideWhenUsed="0" w:uiPriority="67" w:semiHidden="0" w:name="Medium Grid 1 Accent 5"/>
+    <w:lsdException w:unhideWhenUsed="0" w:uiPriority="68" w:semiHidden="0" w:name="Medium Grid 2 Accent 5"/>
+    <w:lsdException w:unhideWhenUsed="0" w:uiPriority="69" w:semiHidden="0" w:name="Medium Grid 3 Accent 5"/>
+    <w:lsdException w:unhideWhenUsed="0" w:uiPriority="70" w:semiHidden="0" w:name="Dark List Accent 5"/>
+    <w:lsdException w:unhideWhenUsed="0" w:uiPriority="71" w:semiHidden="0" w:name="Colorful Shading Accent 5"/>
+    <w:lsdException w:unhideWhenUsed="0" w:uiPriority="72" w:semiHidden="0" w:name="Colorful List Accent 5"/>
+    <w:lsdException w:unhideWhenUsed="0" w:uiPriority="73" w:semiHidden="0" w:name="Colorful Grid Accent 5"/>
+    <w:lsdException w:unhideWhenUsed="0" w:uiPriority="60" w:semiHidden="0" w:name="Light Shading Accent 6"/>
+    <w:lsdException w:unhideWhenUsed="0" w:uiPriority="61" w:semiHidden="0" w:name="Light List Accent 6"/>
+    <w:lsdException w:unhideWhenUsed="0" w:uiPriority="62" w:semiHidden="0" w:name="Light Grid Accent 6"/>
+    <w:lsdException w:unhideWhenUsed="0" w:uiPriority="63" w:semiHidden="0" w:name="Medium Shading 1 Accent 6"/>
+    <w:lsdException w:unhideWhenUsed="0" w:uiPriority="64" w:semiHidden="0" w:name="Medium Shading 2 Accent 6"/>
+    <w:lsdException w:unhideWhenUsed="0" w:uiPriority="65" w:semiHidden="0" w:name="Medium List 1 Accent 6"/>
+    <w:lsdException w:unhideWhenUsed="0" w:uiPriority="66" w:semiHidden="0" w:name="Medium List 2 Accent 6"/>
+    <w:lsdException w:unhideWhenUsed="0" w:uiPriority="67" w:semiHidden="0" w:name="Medium Grid 1 Accent 6"/>
+    <w:lsdException w:unhideWhenUsed="0" w:uiPriority="68" w:semiHidden="0" w:name="Medium Grid 2 Accent 6"/>
+    <w:lsdException w:unhideWhenUsed="0" w:uiPriority="69" w:semiHidden="0" w:name="Medium Grid 3 Accent 6"/>
+    <w:lsdException w:unhideWhenUsed="0" w:uiPriority="70" w:semiHidden="0" w:name="Dark List Accent 6"/>
+    <w:lsdException w:unhideWhenUsed="0" w:uiPriority="71" w:semiHidden="0" w:name="Colorful Shading Accent 6"/>
+    <w:lsdException w:unhideWhenUsed="0" w:uiPriority="72" w:semiHidden="0" w:name="Colorful List Accent 6"/>
+    <w:lsdException w:unhideWhenUsed="0" w:uiPriority="73" w:semiHidden="0" w:name="Colorful Grid Accent 6"/>
   </w:latentStyles>
-  <w:style w:type="paragraph" w:default="1" w:styleId="Normal">
+  <w:style w:type="paragraph" w:default="1" w:styleId="1">
     <w:name w:val="Normal"/>
     <w:qFormat/>
+    <w:uiPriority w:val="0"/>
     <w:pPr>
       <w:spacing w:after="160" w:line="259" w:lineRule="auto"/>
     </w:pPr>
     <w:rPr>
-      <w:rFonts w:asciiTheme="minorHAnsi" w:eastAsiaTheme="minorHAnsi" w:hAnsiTheme="minorHAnsi" w:cstheme="minorBidi"/>
+      <w:rFonts w:asciiTheme="minorHAnsi" w:hAnsiTheme="minorHAnsi" w:eastAsiaTheme="minorHAnsi" w:cstheme="minorBidi"/>
       <w:kern w:val="2"/>
       <w:sz w:val="22"/>
       <w:szCs w:val="22"/>
-      <w:lang w:val="en-IN" w:bidi="ar-SA"/>
+      <w:lang w:val="en-IN" w:eastAsia="en-US" w:bidi="ar-SA"/>
       <w14:ligatures w14:val="standardContextual"/>
     </w:rPr>
   </w:style>
-  <w:style w:type="paragraph" w:styleId="Heading1">
+  <w:style w:type="paragraph" w:styleId="2">
     <w:name w:val="heading 1"/>
-    <w:basedOn w:val="Normal"/>
-    <w:next w:val="Normal"/>
-    <w:link w:val="Heading1Char"/>
+    <w:basedOn w:val="1"/>
+    <w:next w:val="1"/>
+    <w:link w:val="19"/>
+    <w:qFormat/>
     <w:uiPriority w:val="9"/>
-    <w:qFormat/>
     <w:pPr>
       <w:keepNext/>
       <w:keepLines/>
@@ -1568,21 +1448,21 @@
       <w:outlineLvl w:val="0"/>
     </w:pPr>
     <w:rPr>
-      <w:rFonts w:asciiTheme="majorHAnsi" w:eastAsiaTheme="majorEastAsia" w:hAnsiTheme="majorHAnsi" w:cstheme="majorBidi"/>
-      <w:color w:val="2F5496" w:themeColor="accent1" w:themeShade="BF"/>
+      <w:rFonts w:asciiTheme="majorHAnsi" w:hAnsiTheme="majorHAnsi" w:eastAsiaTheme="majorEastAsia" w:cstheme="majorBidi"/>
+      <w:color w:val="2F5597" w:themeColor="accent1" w:themeShade="BF"/>
       <w:sz w:val="40"/>
       <w:szCs w:val="40"/>
     </w:rPr>
   </w:style>
-  <w:style w:type="paragraph" w:styleId="Heading2">
+  <w:style w:type="paragraph" w:styleId="3">
     <w:name w:val="heading 2"/>
-    <w:basedOn w:val="Normal"/>
-    <w:next w:val="Normal"/>
-    <w:link w:val="Heading2Char"/>
-    <w:uiPriority w:val="9"/>
+    <w:basedOn w:val="1"/>
+    <w:next w:val="1"/>
+    <w:link w:val="20"/>
     <w:semiHidden/>
     <w:unhideWhenUsed/>
     <w:qFormat/>
+    <w:uiPriority w:val="9"/>
     <w:pPr>
       <w:keepNext/>
       <w:keepLines/>
@@ -1590,21 +1470,21 @@
       <w:outlineLvl w:val="1"/>
     </w:pPr>
     <w:rPr>
-      <w:rFonts w:asciiTheme="majorHAnsi" w:eastAsiaTheme="majorEastAsia" w:hAnsiTheme="majorHAnsi" w:cstheme="majorBidi"/>
-      <w:color w:val="2F5496" w:themeColor="accent1" w:themeShade="BF"/>
+      <w:rFonts w:asciiTheme="majorHAnsi" w:hAnsiTheme="majorHAnsi" w:eastAsiaTheme="majorEastAsia" w:cstheme="majorBidi"/>
+      <w:color w:val="2F5597" w:themeColor="accent1" w:themeShade="BF"/>
       <w:sz w:val="32"/>
       <w:szCs w:val="32"/>
     </w:rPr>
   </w:style>
-  <w:style w:type="paragraph" w:styleId="Heading3">
+  <w:style w:type="paragraph" w:styleId="4">
     <w:name w:val="heading 3"/>
-    <w:basedOn w:val="Normal"/>
-    <w:next w:val="Normal"/>
-    <w:link w:val="Heading3Char"/>
-    <w:uiPriority w:val="9"/>
+    <w:basedOn w:val="1"/>
+    <w:next w:val="1"/>
+    <w:link w:val="21"/>
     <w:semiHidden/>
     <w:unhideWhenUsed/>
     <w:qFormat/>
+    <w:uiPriority w:val="9"/>
     <w:pPr>
       <w:keepNext/>
       <w:keepLines/>
@@ -1613,20 +1493,20 @@
     </w:pPr>
     <w:rPr>
       <w:rFonts w:eastAsiaTheme="majorEastAsia" w:cstheme="majorBidi"/>
-      <w:color w:val="2F5496" w:themeColor="accent1" w:themeShade="BF"/>
+      <w:color w:val="2F5597" w:themeColor="accent1" w:themeShade="BF"/>
       <w:sz w:val="28"/>
       <w:szCs w:val="28"/>
     </w:rPr>
   </w:style>
-  <w:style w:type="paragraph" w:styleId="Heading4">
+  <w:style w:type="paragraph" w:styleId="5">
     <w:name w:val="heading 4"/>
-    <w:basedOn w:val="Normal"/>
-    <w:next w:val="Normal"/>
-    <w:link w:val="Heading4Char"/>
-    <w:uiPriority w:val="9"/>
+    <w:basedOn w:val="1"/>
+    <w:next w:val="1"/>
+    <w:link w:val="22"/>
     <w:semiHidden/>
     <w:unhideWhenUsed/>
     <w:qFormat/>
+    <w:uiPriority w:val="9"/>
     <w:pPr>
       <w:keepNext/>
       <w:keepLines/>
@@ -1637,18 +1517,18 @@
       <w:rFonts w:eastAsiaTheme="majorEastAsia" w:cstheme="majorBidi"/>
       <w:i/>
       <w:iCs/>
-      <w:color w:val="2F5496" w:themeColor="accent1" w:themeShade="BF"/>
-    </w:rPr>
-  </w:style>
-  <w:style w:type="paragraph" w:styleId="Heading5">
+      <w:color w:val="2F5597" w:themeColor="accent1" w:themeShade="BF"/>
+    </w:rPr>
+  </w:style>
+  <w:style w:type="paragraph" w:styleId="6">
     <w:name w:val="heading 5"/>
-    <w:basedOn w:val="Normal"/>
-    <w:next w:val="Normal"/>
-    <w:link w:val="Heading5Char"/>
-    <w:uiPriority w:val="9"/>
+    <w:basedOn w:val="1"/>
+    <w:next w:val="1"/>
+    <w:link w:val="23"/>
     <w:semiHidden/>
     <w:unhideWhenUsed/>
     <w:qFormat/>
+    <w:uiPriority w:val="9"/>
     <w:pPr>
       <w:keepNext/>
       <w:keepLines/>
@@ -1657,18 +1537,18 @@
     </w:pPr>
     <w:rPr>
       <w:rFonts w:eastAsiaTheme="majorEastAsia" w:cstheme="majorBidi"/>
-      <w:color w:val="2F5496" w:themeColor="accent1" w:themeShade="BF"/>
-    </w:rPr>
-  </w:style>
-  <w:style w:type="paragraph" w:styleId="Heading6">
+      <w:color w:val="2F5597" w:themeColor="accent1" w:themeShade="BF"/>
+    </w:rPr>
+  </w:style>
+  <w:style w:type="paragraph" w:styleId="7">
     <w:name w:val="heading 6"/>
-    <w:basedOn w:val="Normal"/>
-    <w:next w:val="Normal"/>
-    <w:link w:val="Heading6Char"/>
-    <w:uiPriority w:val="9"/>
+    <w:basedOn w:val="1"/>
+    <w:next w:val="1"/>
+    <w:link w:val="24"/>
     <w:semiHidden/>
     <w:unhideWhenUsed/>
     <w:qFormat/>
+    <w:uiPriority w:val="9"/>
     <w:pPr>
       <w:keepNext/>
       <w:keepLines/>
@@ -1680,17 +1560,25 @@
       <w:i/>
       <w:iCs/>
       <w:color w:val="595959" w:themeColor="text1" w:themeTint="A6"/>
-    </w:rPr>
-  </w:style>
-  <w:style w:type="paragraph" w:styleId="Heading7">
+      <w14:textFill>
+        <w14:solidFill>
+          <w14:schemeClr w14:val="tx1">
+            <w14:lumMod w14:val="65000"/>
+            <w14:lumOff w14:val="35000"/>
+          </w14:schemeClr>
+        </w14:solidFill>
+      </w14:textFill>
+    </w:rPr>
+  </w:style>
+  <w:style w:type="paragraph" w:styleId="8">
     <w:name w:val="heading 7"/>
-    <w:basedOn w:val="Normal"/>
-    <w:next w:val="Normal"/>
-    <w:link w:val="Heading7Char"/>
-    <w:uiPriority w:val="9"/>
+    <w:basedOn w:val="1"/>
+    <w:next w:val="1"/>
+    <w:link w:val="25"/>
     <w:semiHidden/>
     <w:unhideWhenUsed/>
     <w:qFormat/>
+    <w:uiPriority w:val="9"/>
     <w:pPr>
       <w:keepNext/>
       <w:keepLines/>
@@ -1700,17 +1588,25 @@
     <w:rPr>
       <w:rFonts w:eastAsiaTheme="majorEastAsia" w:cstheme="majorBidi"/>
       <w:color w:val="595959" w:themeColor="text1" w:themeTint="A6"/>
-    </w:rPr>
-  </w:style>
-  <w:style w:type="paragraph" w:styleId="Heading8">
+      <w14:textFill>
+        <w14:solidFill>
+          <w14:schemeClr w14:val="tx1">
+            <w14:lumMod w14:val="65000"/>
+            <w14:lumOff w14:val="35000"/>
+          </w14:schemeClr>
+        </w14:solidFill>
+      </w14:textFill>
+    </w:rPr>
+  </w:style>
+  <w:style w:type="paragraph" w:styleId="9">
     <w:name w:val="heading 8"/>
-    <w:basedOn w:val="Normal"/>
-    <w:next w:val="Normal"/>
-    <w:link w:val="Heading8Char"/>
-    <w:uiPriority w:val="9"/>
+    <w:basedOn w:val="1"/>
+    <w:next w:val="1"/>
+    <w:link w:val="26"/>
     <w:semiHidden/>
     <w:unhideWhenUsed/>
     <w:qFormat/>
+    <w:uiPriority w:val="9"/>
     <w:pPr>
       <w:keepNext/>
       <w:keepLines/>
@@ -1722,17 +1618,25 @@
       <w:i/>
       <w:iCs/>
       <w:color w:val="262626" w:themeColor="text1" w:themeTint="D9"/>
-    </w:rPr>
-  </w:style>
-  <w:style w:type="paragraph" w:styleId="Heading9">
+      <w14:textFill>
+        <w14:solidFill>
+          <w14:schemeClr w14:val="tx1">
+            <w14:lumMod w14:val="85000"/>
+            <w14:lumOff w14:val="15000"/>
+          </w14:schemeClr>
+        </w14:solidFill>
+      </w14:textFill>
+    </w:rPr>
+  </w:style>
+  <w:style w:type="paragraph" w:styleId="10">
     <w:name w:val="heading 9"/>
-    <w:basedOn w:val="Normal"/>
-    <w:next w:val="Normal"/>
-    <w:link w:val="Heading9Char"/>
-    <w:uiPriority w:val="9"/>
+    <w:basedOn w:val="1"/>
+    <w:next w:val="1"/>
+    <w:link w:val="27"/>
     <w:semiHidden/>
     <w:unhideWhenUsed/>
     <w:qFormat/>
+    <w:uiPriority w:val="9"/>
     <w:pPr>
       <w:keepNext/>
       <w:keepLines/>
@@ -1742,21 +1646,29 @@
     <w:rPr>
       <w:rFonts w:eastAsiaTheme="majorEastAsia" w:cstheme="majorBidi"/>
       <w:color w:val="262626" w:themeColor="text1" w:themeTint="D9"/>
-    </w:rPr>
-  </w:style>
-  <w:style w:type="character" w:default="1" w:styleId="DefaultParagraphFont">
+      <w14:textFill>
+        <w14:solidFill>
+          <w14:schemeClr w14:val="tx1">
+            <w14:lumMod w14:val="85000"/>
+            <w14:lumOff w14:val="15000"/>
+          </w14:schemeClr>
+        </w14:solidFill>
+      </w14:textFill>
+    </w:rPr>
+  </w:style>
+  <w:style w:type="character" w:default="1" w:styleId="11">
     <w:name w:val="Default Paragraph Font"/>
-    <w:uiPriority w:val="1"/>
     <w:semiHidden/>
     <w:unhideWhenUsed/>
-  </w:style>
-  <w:style w:type="table" w:default="1" w:styleId="TableNormal">
+    <w:uiPriority w:val="1"/>
+  </w:style>
+  <w:style w:type="table" w:default="1" w:styleId="12">
     <w:name w:val="Normal Table"/>
-    <w:uiPriority w:val="99"/>
     <w:semiHidden/>
     <w:unhideWhenUsed/>
+    <w:qFormat/>
+    <w:uiPriority w:val="99"/>
     <w:tblPr>
-      <w:tblInd w:w="0" w:type="dxa"/>
       <w:tblCellMar>
         <w:top w:w="0" w:type="dxa"/>
         <w:left w:w="108" w:type="dxa"/>
@@ -1765,19 +1677,13 @@
       </w:tblCellMar>
     </w:tblPr>
   </w:style>
-  <w:style w:type="numbering" w:default="1" w:styleId="NoList">
-    <w:name w:val="No List"/>
+  <w:style w:type="paragraph" w:styleId="13">
+    <w:name w:val="footer"/>
+    <w:basedOn w:val="1"/>
+    <w:link w:val="38"/>
+    <w:unhideWhenUsed/>
+    <w:qFormat/>
     <w:uiPriority w:val="99"/>
-    <w:semiHidden/>
-    <w:unhideWhenUsed/>
-  </w:style>
-  <w:style w:type="paragraph" w:styleId="Footer">
-    <w:name w:val="footer"/>
-    <w:basedOn w:val="Normal"/>
-    <w:link w:val="FooterChar"/>
-    <w:uiPriority w:val="99"/>
-    <w:unhideWhenUsed/>
-    <w:qFormat/>
     <w:pPr>
       <w:tabs>
         <w:tab w:val="center" w:pos="4513"/>
@@ -1786,13 +1692,13 @@
       <w:spacing w:after="0" w:line="240" w:lineRule="auto"/>
     </w:pPr>
   </w:style>
-  <w:style w:type="paragraph" w:styleId="Header">
+  <w:style w:type="paragraph" w:styleId="14">
     <w:name w:val="header"/>
-    <w:basedOn w:val="Normal"/>
-    <w:link w:val="HeaderChar"/>
+    <w:basedOn w:val="1"/>
+    <w:link w:val="37"/>
+    <w:unhideWhenUsed/>
+    <w:qFormat/>
     <w:uiPriority w:val="99"/>
-    <w:unhideWhenUsed/>
-    <w:qFormat/>
     <w:pPr>
       <w:tabs>
         <w:tab w:val="center" w:pos="4513"/>
@@ -1801,224 +1707,277 @@
       <w:spacing w:after="0" w:line="240" w:lineRule="auto"/>
     </w:pPr>
   </w:style>
-  <w:style w:type="character" w:styleId="Hyperlink">
+  <w:style w:type="character" w:styleId="15">
     <w:name w:val="Hyperlink"/>
-    <w:basedOn w:val="DefaultParagraphFont"/>
+    <w:basedOn w:val="11"/>
+    <w:unhideWhenUsed/>
+    <w:qFormat/>
     <w:uiPriority w:val="99"/>
-    <w:unhideWhenUsed/>
-    <w:qFormat/>
     <w:rPr>
       <w:color w:val="0563C1" w:themeColor="hyperlink"/>
       <w:u w:val="single"/>
-    </w:rPr>
-  </w:style>
-  <w:style w:type="paragraph" w:styleId="Subtitle">
+      <w14:textFill>
+        <w14:solidFill>
+          <w14:schemeClr w14:val="hlink"/>
+        </w14:solidFill>
+      </w14:textFill>
+    </w:rPr>
+  </w:style>
+  <w:style w:type="paragraph" w:styleId="16">
     <w:name w:val="Subtitle"/>
-    <w:basedOn w:val="Normal"/>
-    <w:next w:val="Normal"/>
-    <w:link w:val="SubtitleChar"/>
+    <w:basedOn w:val="1"/>
+    <w:next w:val="1"/>
+    <w:link w:val="29"/>
+    <w:qFormat/>
     <w:uiPriority w:val="11"/>
-    <w:qFormat/>
     <w:rPr>
       <w:rFonts w:eastAsiaTheme="majorEastAsia" w:cstheme="majorBidi"/>
       <w:color w:val="595959" w:themeColor="text1" w:themeTint="A6"/>
       <w:spacing w:val="15"/>
       <w:sz w:val="28"/>
       <w:szCs w:val="28"/>
-    </w:rPr>
-  </w:style>
-  <w:style w:type="table" w:styleId="TableGrid">
+      <w14:textFill>
+        <w14:solidFill>
+          <w14:schemeClr w14:val="tx1">
+            <w14:lumMod w14:val="65000"/>
+            <w14:lumOff w14:val="35000"/>
+          </w14:schemeClr>
+        </w14:solidFill>
+      </w14:textFill>
+    </w:rPr>
+  </w:style>
+  <w:style w:type="table" w:styleId="17">
     <w:name w:val="Table Grid"/>
-    <w:basedOn w:val="TableNormal"/>
+    <w:basedOn w:val="12"/>
+    <w:qFormat/>
     <w:uiPriority w:val="39"/>
-    <w:qFormat/>
     <w:rPr>
       <w:lang w:bidi="gu-IN"/>
     </w:rPr>
     <w:tblPr>
       <w:tblBorders>
-        <w:top w:val="single" w:sz="4" w:space="0" w:color="auto"/>
-        <w:left w:val="single" w:sz="4" w:space="0" w:color="auto"/>
-        <w:bottom w:val="single" w:sz="4" w:space="0" w:color="auto"/>
-        <w:right w:val="single" w:sz="4" w:space="0" w:color="auto"/>
-        <w:insideH w:val="single" w:sz="4" w:space="0" w:color="auto"/>
-        <w:insideV w:val="single" w:sz="4" w:space="0" w:color="auto"/>
+        <w:top w:val="single" w:color="auto" w:sz="4" w:space="0"/>
+        <w:left w:val="single" w:color="auto" w:sz="4" w:space="0"/>
+        <w:bottom w:val="single" w:color="auto" w:sz="4" w:space="0"/>
+        <w:right w:val="single" w:color="auto" w:sz="4" w:space="0"/>
+        <w:insideH w:val="single" w:color="auto" w:sz="4" w:space="0"/>
+        <w:insideV w:val="single" w:color="auto" w:sz="4" w:space="0"/>
       </w:tblBorders>
     </w:tblPr>
   </w:style>
-  <w:style w:type="paragraph" w:styleId="Title">
+  <w:style w:type="paragraph" w:styleId="18">
     <w:name w:val="Title"/>
-    <w:basedOn w:val="Normal"/>
-    <w:next w:val="Normal"/>
-    <w:link w:val="TitleChar"/>
+    <w:basedOn w:val="1"/>
+    <w:next w:val="1"/>
+    <w:link w:val="28"/>
+    <w:qFormat/>
     <w:uiPriority w:val="10"/>
-    <w:qFormat/>
     <w:pPr>
       <w:spacing w:after="80" w:line="240" w:lineRule="auto"/>
       <w:contextualSpacing/>
     </w:pPr>
     <w:rPr>
-      <w:rFonts w:asciiTheme="majorHAnsi" w:eastAsiaTheme="majorEastAsia" w:hAnsiTheme="majorHAnsi" w:cstheme="majorBidi"/>
+      <w:rFonts w:asciiTheme="majorHAnsi" w:hAnsiTheme="majorHAnsi" w:eastAsiaTheme="majorEastAsia" w:cstheme="majorBidi"/>
       <w:spacing w:val="-10"/>
       <w:kern w:val="28"/>
       <w:sz w:val="56"/>
       <w:szCs w:val="56"/>
     </w:rPr>
   </w:style>
-  <w:style w:type="character" w:customStyle="1" w:styleId="Heading1Char">
+  <w:style w:type="character" w:customStyle="1" w:styleId="19">
     <w:name w:val="Heading 1 Char"/>
-    <w:basedOn w:val="DefaultParagraphFont"/>
-    <w:link w:val="Heading1"/>
+    <w:basedOn w:val="11"/>
+    <w:link w:val="2"/>
+    <w:qFormat/>
     <w:uiPriority w:val="9"/>
-    <w:qFormat/>
-    <w:rPr>
-      <w:rFonts w:asciiTheme="majorHAnsi" w:eastAsiaTheme="majorEastAsia" w:hAnsiTheme="majorHAnsi" w:cstheme="majorBidi"/>
-      <w:color w:val="2F5496" w:themeColor="accent1" w:themeShade="BF"/>
+    <w:rPr>
+      <w:rFonts w:asciiTheme="majorHAnsi" w:hAnsiTheme="majorHAnsi" w:eastAsiaTheme="majorEastAsia" w:cstheme="majorBidi"/>
+      <w:color w:val="2F5597" w:themeColor="accent1" w:themeShade="BF"/>
       <w:sz w:val="40"/>
       <w:szCs w:val="40"/>
     </w:rPr>
   </w:style>
-  <w:style w:type="character" w:customStyle="1" w:styleId="Heading2Char">
+  <w:style w:type="character" w:customStyle="1" w:styleId="20">
     <w:name w:val="Heading 2 Char"/>
-    <w:basedOn w:val="DefaultParagraphFont"/>
-    <w:link w:val="Heading2"/>
+    <w:basedOn w:val="11"/>
+    <w:link w:val="3"/>
+    <w:semiHidden/>
+    <w:qFormat/>
     <w:uiPriority w:val="9"/>
-    <w:semiHidden/>
-    <w:qFormat/>
-    <w:rPr>
-      <w:rFonts w:asciiTheme="majorHAnsi" w:eastAsiaTheme="majorEastAsia" w:hAnsiTheme="majorHAnsi" w:cstheme="majorBidi"/>
-      <w:color w:val="2F5496" w:themeColor="accent1" w:themeShade="BF"/>
+    <w:rPr>
+      <w:rFonts w:asciiTheme="majorHAnsi" w:hAnsiTheme="majorHAnsi" w:eastAsiaTheme="majorEastAsia" w:cstheme="majorBidi"/>
+      <w:color w:val="2F5597" w:themeColor="accent1" w:themeShade="BF"/>
       <w:sz w:val="32"/>
       <w:szCs w:val="32"/>
     </w:rPr>
   </w:style>
-  <w:style w:type="character" w:customStyle="1" w:styleId="Heading3Char">
+  <w:style w:type="character" w:customStyle="1" w:styleId="21">
     <w:name w:val="Heading 3 Char"/>
-    <w:basedOn w:val="DefaultParagraphFont"/>
-    <w:link w:val="Heading3"/>
+    <w:basedOn w:val="11"/>
+    <w:link w:val="4"/>
+    <w:semiHidden/>
+    <w:qFormat/>
     <w:uiPriority w:val="9"/>
-    <w:semiHidden/>
-    <w:qFormat/>
     <w:rPr>
       <w:rFonts w:eastAsiaTheme="majorEastAsia" w:cstheme="majorBidi"/>
-      <w:color w:val="2F5496" w:themeColor="accent1" w:themeShade="BF"/>
+      <w:color w:val="2F5597" w:themeColor="accent1" w:themeShade="BF"/>
       <w:sz w:val="28"/>
       <w:szCs w:val="28"/>
     </w:rPr>
   </w:style>
-  <w:style w:type="character" w:customStyle="1" w:styleId="Heading4Char">
+  <w:style w:type="character" w:customStyle="1" w:styleId="22">
     <w:name w:val="Heading 4 Char"/>
-    <w:basedOn w:val="DefaultParagraphFont"/>
-    <w:link w:val="Heading4"/>
+    <w:basedOn w:val="11"/>
+    <w:link w:val="5"/>
+    <w:semiHidden/>
+    <w:qFormat/>
     <w:uiPriority w:val="9"/>
-    <w:semiHidden/>
-    <w:qFormat/>
     <w:rPr>
       <w:rFonts w:eastAsiaTheme="majorEastAsia" w:cstheme="majorBidi"/>
       <w:i/>
       <w:iCs/>
-      <w:color w:val="2F5496" w:themeColor="accent1" w:themeShade="BF"/>
-    </w:rPr>
-  </w:style>
-  <w:style w:type="character" w:customStyle="1" w:styleId="Heading5Char">
+      <w:color w:val="2F5597" w:themeColor="accent1" w:themeShade="BF"/>
+    </w:rPr>
+  </w:style>
+  <w:style w:type="character" w:customStyle="1" w:styleId="23">
     <w:name w:val="Heading 5 Char"/>
-    <w:basedOn w:val="DefaultParagraphFont"/>
-    <w:link w:val="Heading5"/>
+    <w:basedOn w:val="11"/>
+    <w:link w:val="6"/>
+    <w:semiHidden/>
+    <w:qFormat/>
     <w:uiPriority w:val="9"/>
+    <w:rPr>
+      <w:rFonts w:eastAsiaTheme="majorEastAsia" w:cstheme="majorBidi"/>
+      <w:color w:val="2F5597" w:themeColor="accent1" w:themeShade="BF"/>
+    </w:rPr>
+  </w:style>
+  <w:style w:type="character" w:customStyle="1" w:styleId="24">
+    <w:name w:val="Heading 6 Char"/>
+    <w:basedOn w:val="11"/>
+    <w:link w:val="7"/>
     <w:semiHidden/>
     <w:qFormat/>
-    <w:rPr>
-      <w:rFonts w:eastAsiaTheme="majorEastAsia" w:cstheme="majorBidi"/>
-      <w:color w:val="2F5496" w:themeColor="accent1" w:themeShade="BF"/>
-    </w:rPr>
-  </w:style>
-  <w:style w:type="character" w:customStyle="1" w:styleId="Heading6Char">
-    <w:name w:val="Heading 6 Char"/>
-    <w:basedOn w:val="DefaultParagraphFont"/>
-    <w:link w:val="Heading6"/>
     <w:uiPriority w:val="9"/>
-    <w:semiHidden/>
-    <w:qFormat/>
     <w:rPr>
       <w:rFonts w:eastAsiaTheme="majorEastAsia" w:cstheme="majorBidi"/>
       <w:i/>
       <w:iCs/>
       <w:color w:val="595959" w:themeColor="text1" w:themeTint="A6"/>
-    </w:rPr>
-  </w:style>
-  <w:style w:type="character" w:customStyle="1" w:styleId="Heading7Char">
+      <w14:textFill>
+        <w14:solidFill>
+          <w14:schemeClr w14:val="tx1">
+            <w14:lumMod w14:val="65000"/>
+            <w14:lumOff w14:val="35000"/>
+          </w14:schemeClr>
+        </w14:solidFill>
+      </w14:textFill>
+    </w:rPr>
+  </w:style>
+  <w:style w:type="character" w:customStyle="1" w:styleId="25">
     <w:name w:val="Heading 7 Char"/>
-    <w:basedOn w:val="DefaultParagraphFont"/>
-    <w:link w:val="Heading7"/>
+    <w:basedOn w:val="11"/>
+    <w:link w:val="8"/>
+    <w:semiHidden/>
+    <w:qFormat/>
     <w:uiPriority w:val="9"/>
-    <w:semiHidden/>
-    <w:qFormat/>
     <w:rPr>
       <w:rFonts w:eastAsiaTheme="majorEastAsia" w:cstheme="majorBidi"/>
       <w:color w:val="595959" w:themeColor="text1" w:themeTint="A6"/>
-    </w:rPr>
-  </w:style>
-  <w:style w:type="character" w:customStyle="1" w:styleId="Heading8Char">
+      <w14:textFill>
+        <w14:solidFill>
+          <w14:schemeClr w14:val="tx1">
+            <w14:lumMod w14:val="65000"/>
+            <w14:lumOff w14:val="35000"/>
+          </w14:schemeClr>
+        </w14:solidFill>
+      </w14:textFill>
+    </w:rPr>
+  </w:style>
+  <w:style w:type="character" w:customStyle="1" w:styleId="26">
     <w:name w:val="Heading 8 Char"/>
-    <w:basedOn w:val="DefaultParagraphFont"/>
-    <w:link w:val="Heading8"/>
+    <w:basedOn w:val="11"/>
+    <w:link w:val="9"/>
+    <w:semiHidden/>
+    <w:qFormat/>
     <w:uiPriority w:val="9"/>
-    <w:semiHidden/>
-    <w:qFormat/>
     <w:rPr>
       <w:rFonts w:eastAsiaTheme="majorEastAsia" w:cstheme="majorBidi"/>
       <w:i/>
       <w:iCs/>
       <w:color w:val="262626" w:themeColor="text1" w:themeTint="D9"/>
-    </w:rPr>
-  </w:style>
-  <w:style w:type="character" w:customStyle="1" w:styleId="Heading9Char">
+      <w14:textFill>
+        <w14:solidFill>
+          <w14:schemeClr w14:val="tx1">
+            <w14:lumMod w14:val="85000"/>
+            <w14:lumOff w14:val="15000"/>
+          </w14:schemeClr>
+        </w14:solidFill>
+      </w14:textFill>
+    </w:rPr>
+  </w:style>
+  <w:style w:type="character" w:customStyle="1" w:styleId="27">
     <w:name w:val="Heading 9 Char"/>
-    <w:basedOn w:val="DefaultParagraphFont"/>
-    <w:link w:val="Heading9"/>
+    <w:basedOn w:val="11"/>
+    <w:link w:val="10"/>
+    <w:semiHidden/>
+    <w:qFormat/>
     <w:uiPriority w:val="9"/>
-    <w:semiHidden/>
-    <w:qFormat/>
     <w:rPr>
       <w:rFonts w:eastAsiaTheme="majorEastAsia" w:cstheme="majorBidi"/>
       <w:color w:val="262626" w:themeColor="text1" w:themeTint="D9"/>
-    </w:rPr>
-  </w:style>
-  <w:style w:type="character" w:customStyle="1" w:styleId="TitleChar">
+      <w14:textFill>
+        <w14:solidFill>
+          <w14:schemeClr w14:val="tx1">
+            <w14:lumMod w14:val="85000"/>
+            <w14:lumOff w14:val="15000"/>
+          </w14:schemeClr>
+        </w14:solidFill>
+      </w14:textFill>
+    </w:rPr>
+  </w:style>
+  <w:style w:type="character" w:customStyle="1" w:styleId="28">
     <w:name w:val="Title Char"/>
-    <w:basedOn w:val="DefaultParagraphFont"/>
-    <w:link w:val="Title"/>
+    <w:basedOn w:val="11"/>
+    <w:link w:val="18"/>
+    <w:qFormat/>
     <w:uiPriority w:val="10"/>
-    <w:qFormat/>
-    <w:rPr>
-      <w:rFonts w:asciiTheme="majorHAnsi" w:eastAsiaTheme="majorEastAsia" w:hAnsiTheme="majorHAnsi" w:cstheme="majorBidi"/>
+    <w:rPr>
+      <w:rFonts w:asciiTheme="majorHAnsi" w:hAnsiTheme="majorHAnsi" w:eastAsiaTheme="majorEastAsia" w:cstheme="majorBidi"/>
       <w:spacing w:val="-10"/>
       <w:kern w:val="28"/>
       <w:sz w:val="56"/>
       <w:szCs w:val="56"/>
     </w:rPr>
   </w:style>
-  <w:style w:type="character" w:customStyle="1" w:styleId="SubtitleChar">
+  <w:style w:type="character" w:customStyle="1" w:styleId="29">
     <w:name w:val="Subtitle Char"/>
-    <w:basedOn w:val="DefaultParagraphFont"/>
-    <w:link w:val="Subtitle"/>
+    <w:basedOn w:val="11"/>
+    <w:link w:val="16"/>
+    <w:qFormat/>
     <w:uiPriority w:val="11"/>
-    <w:qFormat/>
     <w:rPr>
       <w:rFonts w:eastAsiaTheme="majorEastAsia" w:cstheme="majorBidi"/>
       <w:color w:val="595959" w:themeColor="text1" w:themeTint="A6"/>
       <w:spacing w:val="15"/>
       <w:sz w:val="28"/>
       <w:szCs w:val="28"/>
-    </w:rPr>
-  </w:style>
-  <w:style w:type="paragraph" w:styleId="Quote">
+      <w14:textFill>
+        <w14:solidFill>
+          <w14:schemeClr w14:val="tx1">
+            <w14:lumMod w14:val="65000"/>
+            <w14:lumOff w14:val="35000"/>
+          </w14:schemeClr>
+        </w14:solidFill>
+      </w14:textFill>
+    </w:rPr>
+  </w:style>
+  <w:style w:type="paragraph" w:styleId="30">
     <w:name w:val="Quote"/>
-    <w:basedOn w:val="Normal"/>
-    <w:next w:val="Normal"/>
-    <w:link w:val="QuoteChar"/>
+    <w:basedOn w:val="1"/>
+    <w:next w:val="1"/>
+    <w:link w:val="31"/>
+    <w:qFormat/>
     <w:uiPriority w:val="29"/>
-    <w:qFormat/>
     <w:pPr>
       <w:spacing w:before="160"/>
       <w:jc w:val="center"/>
@@ -2027,52 +1986,68 @@
       <w:i/>
       <w:iCs/>
       <w:color w:val="404040" w:themeColor="text1" w:themeTint="BF"/>
-    </w:rPr>
-  </w:style>
-  <w:style w:type="character" w:customStyle="1" w:styleId="QuoteChar">
+      <w14:textFill>
+        <w14:solidFill>
+          <w14:schemeClr w14:val="tx1">
+            <w14:lumMod w14:val="75000"/>
+            <w14:lumOff w14:val="25000"/>
+          </w14:schemeClr>
+        </w14:solidFill>
+      </w14:textFill>
+    </w:rPr>
+  </w:style>
+  <w:style w:type="character" w:customStyle="1" w:styleId="31">
     <w:name w:val="Quote Char"/>
-    <w:basedOn w:val="DefaultParagraphFont"/>
-    <w:link w:val="Quote"/>
+    <w:basedOn w:val="11"/>
+    <w:link w:val="30"/>
+    <w:qFormat/>
     <w:uiPriority w:val="29"/>
-    <w:qFormat/>
     <w:rPr>
       <w:i/>
       <w:iCs/>
       <w:color w:val="404040" w:themeColor="text1" w:themeTint="BF"/>
-    </w:rPr>
-  </w:style>
-  <w:style w:type="paragraph" w:styleId="ListParagraph">
+      <w14:textFill>
+        <w14:solidFill>
+          <w14:schemeClr w14:val="tx1">
+            <w14:lumMod w14:val="75000"/>
+            <w14:lumOff w14:val="25000"/>
+          </w14:schemeClr>
+        </w14:solidFill>
+      </w14:textFill>
+    </w:rPr>
+  </w:style>
+  <w:style w:type="paragraph" w:styleId="32">
     <w:name w:val="List Paragraph"/>
-    <w:basedOn w:val="Normal"/>
+    <w:basedOn w:val="1"/>
+    <w:qFormat/>
     <w:uiPriority w:val="34"/>
-    <w:qFormat/>
     <w:pPr>
       <w:ind w:left="720"/>
       <w:contextualSpacing/>
     </w:pPr>
   </w:style>
-  <w:style w:type="character" w:customStyle="1" w:styleId="IntenseEmphasis1">
+  <w:style w:type="character" w:customStyle="1" w:styleId="33">
     <w:name w:val="Intense Emphasis1"/>
-    <w:basedOn w:val="DefaultParagraphFont"/>
+    <w:basedOn w:val="11"/>
+    <w:qFormat/>
     <w:uiPriority w:val="21"/>
-    <w:qFormat/>
     <w:rPr>
       <w:i/>
       <w:iCs/>
-      <w:color w:val="2F5496" w:themeColor="accent1" w:themeShade="BF"/>
-    </w:rPr>
-  </w:style>
-  <w:style w:type="paragraph" w:styleId="IntenseQuote">
+      <w:color w:val="2F5597" w:themeColor="accent1" w:themeShade="BF"/>
+    </w:rPr>
+  </w:style>
+  <w:style w:type="paragraph" w:styleId="34">
     <w:name w:val="Intense Quote"/>
-    <w:basedOn w:val="Normal"/>
-    <w:next w:val="Normal"/>
-    <w:link w:val="IntenseQuoteChar"/>
+    <w:basedOn w:val="1"/>
+    <w:next w:val="1"/>
+    <w:link w:val="35"/>
+    <w:qFormat/>
     <w:uiPriority w:val="30"/>
-    <w:qFormat/>
     <w:pPr>
       <w:pBdr>
-        <w:top w:val="single" w:sz="4" w:space="10" w:color="2F5496" w:themeColor="accent1" w:themeShade="BF"/>
-        <w:bottom w:val="single" w:sz="4" w:space="10" w:color="2F5496" w:themeColor="accent1" w:themeShade="BF"/>
+        <w:top w:val="single" w:color="2F5496" w:themeColor="accent1" w:themeShade="BF" w:sz="4" w:space="10"/>
+        <w:bottom w:val="single" w:color="2F5496" w:themeColor="accent1" w:themeShade="BF" w:sz="4" w:space="10"/>
       </w:pBdr>
       <w:spacing w:before="360" w:after="360"/>
       <w:ind w:left="864" w:right="864"/>
@@ -2081,47 +2056,47 @@
     <w:rPr>
       <w:i/>
       <w:iCs/>
-      <w:color w:val="2F5496" w:themeColor="accent1" w:themeShade="BF"/>
-    </w:rPr>
-  </w:style>
-  <w:style w:type="character" w:customStyle="1" w:styleId="IntenseQuoteChar">
+      <w:color w:val="2F5597" w:themeColor="accent1" w:themeShade="BF"/>
+    </w:rPr>
+  </w:style>
+  <w:style w:type="character" w:customStyle="1" w:styleId="35">
     <w:name w:val="Intense Quote Char"/>
-    <w:basedOn w:val="DefaultParagraphFont"/>
-    <w:link w:val="IntenseQuote"/>
+    <w:basedOn w:val="11"/>
+    <w:link w:val="34"/>
+    <w:qFormat/>
     <w:uiPriority w:val="30"/>
-    <w:qFormat/>
     <w:rPr>
       <w:i/>
       <w:iCs/>
-      <w:color w:val="2F5496" w:themeColor="accent1" w:themeShade="BF"/>
-    </w:rPr>
-  </w:style>
-  <w:style w:type="character" w:customStyle="1" w:styleId="IntenseReference1">
+      <w:color w:val="2F5597" w:themeColor="accent1" w:themeShade="BF"/>
+    </w:rPr>
+  </w:style>
+  <w:style w:type="character" w:customStyle="1" w:styleId="36">
     <w:name w:val="Intense Reference1"/>
-    <w:basedOn w:val="DefaultParagraphFont"/>
+    <w:basedOn w:val="11"/>
+    <w:qFormat/>
     <w:uiPriority w:val="32"/>
-    <w:qFormat/>
     <w:rPr>
       <w:b/>
       <w:bCs/>
       <w:smallCaps/>
-      <w:color w:val="2F5496" w:themeColor="accent1" w:themeShade="BF"/>
+      <w:color w:val="2F5597" w:themeColor="accent1" w:themeShade="BF"/>
       <w:spacing w:val="5"/>
     </w:rPr>
   </w:style>
-  <w:style w:type="character" w:customStyle="1" w:styleId="HeaderChar">
+  <w:style w:type="character" w:customStyle="1" w:styleId="37">
     <w:name w:val="Header Char"/>
-    <w:basedOn w:val="DefaultParagraphFont"/>
-    <w:link w:val="Header"/>
+    <w:basedOn w:val="11"/>
+    <w:link w:val="14"/>
+    <w:qFormat/>
     <w:uiPriority w:val="99"/>
-    <w:qFormat/>
-  </w:style>
-  <w:style w:type="character" w:customStyle="1" w:styleId="FooterChar">
+  </w:style>
+  <w:style w:type="character" w:customStyle="1" w:styleId="38">
     <w:name w:val="Footer Char"/>
-    <w:basedOn w:val="DefaultParagraphFont"/>
-    <w:link w:val="Footer"/>
+    <w:basedOn w:val="11"/>
+    <w:link w:val="13"/>
+    <w:qFormat/>
     <w:uiPriority w:val="99"/>
-    <w:qFormat/>
   </w:style>
 </w:styles>
 </file>
@@ -2378,7 +2353,6 @@
     </a:fmtScheme>
   </a:themeElements>
   <a:objectDefaults/>
-  <a:extraClrSchemeLst/>
 </a:theme>
 </file>
 

</xml_diff>